<commit_message>
docs: enrich Laporan Minggu 1 with FR/NFR matrices, architecture diagram, and device test screenshots
</commit_message>
<xml_diff>
--- a/Laporan_Minggu_1_LabInventory_Naila_Fathia.docx
+++ b/Laporan_Minggu_1_LabInventory_Naila_Fathia.docx
@@ -44,7 +44,7 @@
           <w:color w:val="000000"/>
           <w:sz w:val="22"/>
         </w:rPr>
-        <w:t>“Inisiasi Proyek, Analisis Kebutuhan Sistem, Perancangan Use Case, Wireframe, dan Setup Environment Flutter pada Aplikasi LabInventory”</w:t>
+        <w:t>“Inisiasi Proyek, Analisis Kebutuhan Sistem, Pemodelan Use Case, Wireframe, dan Setup Environment Flutter pada Aplikasi LabInventory”</w:t>
       </w:r>
     </w:p>
     <w:p>
@@ -200,7 +200,7 @@
           <w:rFonts w:ascii="Times New Roman" w:hAnsi="Times New Roman"/>
           <w:sz w:val="22"/>
         </w:rPr>
-        <w:t>Puji dan syukur senantiasa penyusun panjatkan kehadirat Tuhan Yang Maha Kuasa atas limpahan rahmat, taufik, serta petunjuk-Nya, sehingga naskah dokumen tugas yang berjudul “Laporan Praktikum Kemajuan Proyek Minggu I: Inisiasi Proyek, Analisis Kebutuhan Sistem, Perancangan Use Case, Wireframe, dan Setup Environment Flutter pada Aplikasi LabInventory” dapat diselesaikan dengan tuntas, optimal, dan tepat waktu.</w:t>
+        <w:t>Puji dan syukur senantiasa penyusun panjatkan kehadirat Tuhan Yang Maha Kuasa atas limpahan rahmat, taufik, serta petunjuk-Nya, sehingga naskah dokumen tugas yang berjudul “Laporan Praktikum Kemajuan Proyek Minggu I: Inisiasi Proyek, Analisis Kebutuhan Sistem, Pemodelan Use Case, Wireframe, dan Setup Environment Flutter pada Aplikasi LabInventory” dapat diselesaikan dengan tuntas, optimal, dan tepat waktu.</w:t>
       </w:r>
     </w:p>
     <w:p>
@@ -327,7 +327,7 @@
           <w:rFonts w:ascii="Times New Roman" w:hAnsi="Times New Roman"/>
           <w:sz w:val="22"/>
         </w:rPr>
-        <w:t>Sebelum inisiasi proyek LabInventory, seluruh tata kelola pencatatan aset inventaris dan proses permohonan peminjaman masih dilakukan secara manual menggunakan buku registrasi fisik dan formulir kertas. Berdasarkan analisis observasi lapangan, metode manual ini menimbulkan empat kelemahan mendasar:</w:t>
+        <w:t>Sebelum inisiasi proyek LabInventory, seluruh tata kelola pencatatan aset inventaris dan proses permohonan peminjaman masih dilakukan secara manual menggunakan buku registrasi fisik dan formulir kertas. Berdasarkan analisis observasi lapangan dan wawancara dengan pengelola laboratorium, metode manual tersebut menimbulkan empat kelemahan operasional mendasar:</w:t>
       </w:r>
     </w:p>
     <w:p>
@@ -342,14 +342,14 @@
           <w:b/>
           <w:sz w:val="22"/>
         </w:rPr>
-        <w:t xml:space="preserve">1. Risiko Kehilangan Dokumen: </w:t>
+        <w:t xml:space="preserve">1. Risiko Kerusakan Dokumen Fisik: </w:t>
       </w:r>
       <w:r>
         <w:rPr>
           <w:rFonts w:ascii="Times New Roman" w:hAnsi="Times New Roman"/>
           <w:sz w:val="22"/>
         </w:rPr>
-        <w:t>Formulir kertas rentan basah, robek, atau terselip, mengakibatkan rekonsiliasi stok di akhir semester mengalami disinformasi.</w:t>
+        <w:t>Formulir kertas rentan basah, robek, atau terselip, mengakibatkan rekonsiliasi data inventaris di akhir semester sering mengalami disinformasi dan selisih pembukuan.</w:t>
       </w:r>
     </w:p>
     <w:p>
@@ -364,14 +364,14 @@
           <w:b/>
           <w:sz w:val="22"/>
         </w:rPr>
-        <w:t xml:space="preserve">2. Ketiadaan Transparansi Stok: </w:t>
+        <w:t xml:space="preserve">2. Ketiadaan Transparansi Sisa Stok: </w:t>
       </w:r>
       <w:r>
         <w:rPr>
           <w:rFonts w:ascii="Times New Roman" w:hAnsi="Times New Roman"/>
           <w:sz w:val="22"/>
         </w:rPr>
-        <w:t>Mahasiswa tidak memiliki sarana untuk memantau sisa stok alat praktikum yang tersedia tanpa harus datang langsung ke ruangan laboratorium.</w:t>
+        <w:t>Mahasiswa tidak memiliki sarana untuk memantau sisa stok alat praktikum yang tersedia secara realtime tanpa harus datang secara langsung ke ruangan laboratorium.</w:t>
       </w:r>
     </w:p>
     <w:p>
@@ -393,7 +393,7 @@
           <w:rFonts w:ascii="Times New Roman" w:hAnsi="Times New Roman"/>
           <w:sz w:val="22"/>
         </w:rPr>
-        <w:t>Laboran mengalami kesulitan melacak mahasiswa yang terlambat mengembalikan alat praktikum melewati tenggat jadwal perkuliahan.</w:t>
+        <w:t>Laboran mengalami kesulitan melacak mahasiswa yang terlambat mengembalikan alat praktikum melewati tenggat jadwal mata kuliah yang telah ditentukan.</w:t>
       </w:r>
     </w:p>
     <w:p>
@@ -408,14 +408,14 @@
           <w:b/>
           <w:sz w:val="22"/>
         </w:rPr>
-        <w:t xml:space="preserve">4. Ketiadaan Inspeksi Fisik: </w:t>
+        <w:t xml:space="preserve">4. Ketiadaan Audit Kondisi Fisik Alat: </w:t>
       </w:r>
       <w:r>
         <w:rPr>
           <w:rFonts w:ascii="Times New Roman" w:hAnsi="Times New Roman"/>
           <w:sz w:val="22"/>
         </w:rPr>
-        <w:t>Tidak ada formulir verifikasi kondisi fisik alat sebelum dipinjam dan setelah dikembalikan, sehingga kerusakan sulit dipertanggungjawabkan.</w:t>
+        <w:t>Tidak ada formulir verifikasi kondisi fisik alat sebelum dipinjam dan sesudah dikembalikan, sehingga kerusakan barang sulit dipertanggungjawabkan secara adil.</w:t>
       </w:r>
     </w:p>
     <w:p>
@@ -430,7 +430,175 @@
           <w:color w:val="000000"/>
           <w:sz w:val="23"/>
         </w:rPr>
-        <w:t>1.2 Capaian Pembelajaran &amp; Tujuan Praktikum</w:t>
+        <w:t>1.2 Rumusan Masalah</w:t>
+      </w:r>
+    </w:p>
+    <w:p>
+      <w:pPr>
+        <w:spacing w:after="160" w:line="312" w:lineRule="auto"/>
+        <w:jc w:val="both"/>
+      </w:pPr>
+      <w:r>
+        <w:rPr>
+          <w:rFonts w:ascii="Times New Roman" w:hAnsi="Times New Roman"/>
+          <w:sz w:val="22"/>
+        </w:rPr>
+        <w:t>Berdasarkan latar belakang di atas, rumusan masalah yang menjadi fokus penyelesaian proyek ini adalah:</w:t>
+      </w:r>
+    </w:p>
+    <w:p>
+      <w:pPr>
+        <w:pStyle w:val="ListBullet"/>
+        <w:spacing w:after="80" w:line="288" w:lineRule="auto"/>
+        <w:jc w:val="both"/>
+      </w:pPr>
+      <w:r>
+        <w:rPr>
+          <w:rFonts w:ascii="Times New Roman" w:hAnsi="Times New Roman"/>
+          <w:sz w:val="22"/>
+        </w:rPr>
+        <w:t>Bagaimana merancang sistem inventaris mobile yang mampu mendigitalkan alur peminjaman secara efisien dan transparan?</w:t>
+      </w:r>
+    </w:p>
+    <w:p>
+      <w:pPr>
+        <w:pStyle w:val="ListBullet"/>
+        <w:spacing w:after="80" w:line="288" w:lineRule="auto"/>
+        <w:jc w:val="both"/>
+      </w:pPr>
+      <w:r>
+        <w:rPr>
+          <w:rFonts w:ascii="Times New Roman" w:hAnsi="Times New Roman"/>
+          <w:sz w:val="22"/>
+        </w:rPr>
+        <w:t>Bagaimana memisahkan hak akses sistem secara tegas antara peran Mahasiswa (peminjam) dan Laboran (administrator)?</w:t>
+      </w:r>
+    </w:p>
+    <w:p>
+      <w:pPr>
+        <w:pStyle w:val="ListBullet"/>
+        <w:spacing w:after="80" w:line="288" w:lineRule="auto"/>
+        <w:jc w:val="both"/>
+      </w:pPr>
+      <w:r>
+        <w:rPr>
+          <w:rFonts w:ascii="Times New Roman" w:hAnsi="Times New Roman"/>
+          <w:sz w:val="22"/>
+        </w:rPr>
+        <w:t>Bagaimana memvalidasi ketersediaan stok barang secara realtime guna mencegah peminjaman melebihi kuota fisik yang ada?</w:t>
+      </w:r>
+    </w:p>
+    <w:p>
+      <w:pPr>
+        <w:pStyle w:val="ListBullet"/>
+        <w:spacing w:after="80" w:line="288" w:lineRule="auto"/>
+        <w:jc w:val="both"/>
+      </w:pPr>
+      <w:r>
+        <w:rPr>
+          <w:rFonts w:ascii="Times New Roman" w:hAnsi="Times New Roman"/>
+          <w:sz w:val="22"/>
+        </w:rPr>
+        <w:t>Bagaimana mengonfigurasi environment pengembangan Flutter SDK dan native Android yang andal untuk mendukung konektivitas cloud?</w:t>
+      </w:r>
+    </w:p>
+    <w:p>
+      <w:pPr>
+        <w:keepNext/>
+        <w:spacing w:before="240" w:after="80"/>
+      </w:pPr>
+      <w:r>
+        <w:rPr>
+          <w:rFonts w:ascii="Times New Roman" w:hAnsi="Times New Roman"/>
+          <w:b/>
+          <w:color w:val="000000"/>
+          <w:sz w:val="23"/>
+        </w:rPr>
+        <w:t>1.3 Batasan Masalah</w:t>
+      </w:r>
+    </w:p>
+    <w:p>
+      <w:pPr>
+        <w:spacing w:after="160" w:line="312" w:lineRule="auto"/>
+        <w:jc w:val="both"/>
+      </w:pPr>
+      <w:r>
+        <w:rPr>
+          <w:rFonts w:ascii="Times New Roman" w:hAnsi="Times New Roman"/>
+          <w:sz w:val="22"/>
+        </w:rPr>
+        <w:t>Agar pengerjaan proyek terarah dan tepat guna, batasan masalah ditetapkan sebagai berikut:</w:t>
+      </w:r>
+    </w:p>
+    <w:p>
+      <w:pPr>
+        <w:pStyle w:val="ListBullet"/>
+        <w:spacing w:after="80" w:line="288" w:lineRule="auto"/>
+        <w:jc w:val="both"/>
+      </w:pPr>
+      <w:r>
+        <w:rPr>
+          <w:rFonts w:ascii="Times New Roman" w:hAnsi="Times New Roman"/>
+          <w:sz w:val="22"/>
+        </w:rPr>
+        <w:t>Aplikasi dibangun menggunakan framework Flutter 3.x dengan bahasa pemrograman Dart 3.x.</w:t>
+      </w:r>
+    </w:p>
+    <w:p>
+      <w:pPr>
+        <w:pStyle w:val="ListBullet"/>
+        <w:spacing w:after="80" w:line="288" w:lineRule="auto"/>
+        <w:jc w:val="both"/>
+      </w:pPr>
+      <w:r>
+        <w:rPr>
+          <w:rFonts w:ascii="Times New Roman" w:hAnsi="Times New Roman"/>
+          <w:sz w:val="22"/>
+        </w:rPr>
+        <w:t>Sistem backend menggunakan layanan Supabase Cloud dengan basis data relasional PostgreSQL 15.</w:t>
+      </w:r>
+    </w:p>
+    <w:p>
+      <w:pPr>
+        <w:pStyle w:val="ListBullet"/>
+        <w:spacing w:after="80" w:line="288" w:lineRule="auto"/>
+        <w:jc w:val="both"/>
+      </w:pPr>
+      <w:r>
+        <w:rPr>
+          <w:rFonts w:ascii="Times New Roman" w:hAnsi="Times New Roman"/>
+          <w:sz w:val="22"/>
+        </w:rPr>
+        <w:t>Target sistem operasi difokuskan pada perangkat mobile Android (minimum Android 8.0 Oreo, target Android 14).</w:t>
+      </w:r>
+    </w:p>
+    <w:p>
+      <w:pPr>
+        <w:pStyle w:val="ListBullet"/>
+        <w:spacing w:after="80" w:line="288" w:lineRule="auto"/>
+        <w:jc w:val="both"/>
+      </w:pPr>
+      <w:r>
+        <w:rPr>
+          <w:rFonts w:ascii="Times New Roman" w:hAnsi="Times New Roman"/>
+          <w:sz w:val="22"/>
+        </w:rPr>
+        <w:t>Aktor pengguna dibatasi pada dua peran utama: Mahasiswa aktif PTI dan Laboran resmi Laboratorium Komputer FKIP Unila.</w:t>
+      </w:r>
+    </w:p>
+    <w:p>
+      <w:pPr>
+        <w:keepNext/>
+        <w:spacing w:before="240" w:after="80"/>
+      </w:pPr>
+      <w:r>
+        <w:rPr>
+          <w:rFonts w:ascii="Times New Roman" w:hAnsi="Times New Roman"/>
+          <w:b/>
+          <w:color w:val="000000"/>
+          <w:sz w:val="23"/>
+        </w:rPr>
+        <w:t>1.4 Capaian Pembelajaran &amp; Tujuan Praktikum</w:t>
       </w:r>
     </w:p>
     <w:p>
@@ -471,7 +639,7 @@
           <w:rFonts w:ascii="Times New Roman" w:hAnsi="Times New Roman"/>
           <w:sz w:val="22"/>
         </w:rPr>
-        <w:t>Merumuskan model use case yang memisahkan hak akses antara Mahasiswa (peminjam) dan Laboran (administrator).</w:t>
+        <w:t>Merumuskan model use case yang memisahkan hak akses antara Mahasiswa dan Laboran secara presisi.</w:t>
       </w:r>
     </w:p>
     <w:p>
@@ -485,7 +653,7 @@
           <w:rFonts w:ascii="Times New Roman" w:hAnsi="Times New Roman"/>
           <w:sz w:val="22"/>
         </w:rPr>
-        <w:t>Merancang sketsa alur 4 langkah peminjaman digital (Pilih Alat, Formulir, Verifikasi KTM, Pengembalian &amp; Cek Fisik).</w:t>
+        <w:t>Merancang sketsa alur transaksi 4 tahap terstruktur (Pilih Alat, Formulir, Verifikasi KTM, Pengembalian &amp; Cek Fisik).</w:t>
       </w:r>
     </w:p>
     <w:p>
@@ -514,7 +682,7 @@
           <w:color w:val="000000"/>
           <w:sz w:val="23"/>
         </w:rPr>
-        <w:t>1.3 Manfaat Praktikum</w:t>
+        <w:t>1.5 Manfaat Praktikum</w:t>
       </w:r>
     </w:p>
     <w:p>
@@ -527,7 +695,7 @@
           <w:rFonts w:ascii="Times New Roman" w:hAnsi="Times New Roman"/>
           <w:sz w:val="22"/>
         </w:rPr>
-        <w:t>Praktikum ini memberikan fondasi rekayasa kebutuhan perangkat lunak yang kokoh bagi mahasiswa pengembang, sekaligus merancang solusi digitalisasi yang tepat guna bagi laboratorium komputer PTI FKIP Unila.</w:t>
+        <w:t>Praktikum ini memberikan fondasi rekayasa kebutuhan perangkat lunak yang kokoh bagi mahasiswa pengembang, sekaligus merancang solusi digitalisasi yang tepat guna dan bernilai guna tinggi bagi Laboratorium Komputer PTI FKIP Unila.</w:t>
       </w:r>
     </w:p>
     <w:p>
@@ -574,7 +742,1627 @@
           <w:color w:val="000000"/>
           <w:sz w:val="23"/>
         </w:rPr>
-        <w:t>2.1 Konsep Arsitektur Mobile &amp; Use Case</w:t>
+        <w:t>2.1 Analisis Kebutuhan Fungsional (Functional Requirements)</w:t>
+      </w:r>
+    </w:p>
+    <w:p>
+      <w:pPr>
+        <w:spacing w:after="160" w:line="312" w:lineRule="auto"/>
+        <w:jc w:val="both"/>
+      </w:pPr>
+      <w:r>
+        <w:rPr>
+          <w:rFonts w:ascii="Times New Roman" w:hAnsi="Times New Roman"/>
+          <w:sz w:val="22"/>
+        </w:rPr>
+        <w:t>Kebutuhan fungsional mendefinisikan kapabilitas dan fitur operasional yang wajib disediakan oleh sistem mobile LabInventory. Matriks kebutuhan fungsional dirumuskan pada tabel berikut:</w:t>
+      </w:r>
+    </w:p>
+    <w:p>
+      <w:pPr>
+        <w:keepNext/>
+        <w:spacing w:before="160" w:after="80"/>
+      </w:pPr>
+      <w:r>
+        <w:rPr>
+          <w:rFonts w:ascii="Times New Roman" w:hAnsi="Times New Roman"/>
+          <w:b/>
+          <w:sz w:val="21"/>
+        </w:rPr>
+        <w:t>Tabel 1.1: Matriks Kebutuhan Fungsional Sistem LabInventory</w:t>
+      </w:r>
+    </w:p>
+    <w:tbl>
+      <w:tblPr>
+        <w:tblW w:type="auto" w:w="0"/>
+        <w:jc w:val="center"/>
+        <w:tblLook w:firstColumn="1" w:firstRow="1" w:lastColumn="0" w:lastRow="0" w:noHBand="0" w:noVBand="1" w:val="04A0"/>
+        <w:tblBorders>
+          <w:top w:val="single" w:sz="12" w:space="0" w:color="000000"/>
+          <w:left w:val="none"/>
+          <w:bottom w:val="single" w:sz="12" w:space="0" w:color="000000"/>
+          <w:right w:val="none"/>
+          <w:insideH w:val="single" w:sz="4" w:space="0" w:color="CCCCCC"/>
+          <w:insideV w:val="none"/>
+        </w:tblBorders>
+      </w:tblPr>
+      <w:tblGrid>
+        <w:gridCol w:w="1820"/>
+        <w:gridCol w:w="1820"/>
+        <w:gridCol w:w="1820"/>
+        <w:gridCol w:w="1820"/>
+        <w:gridCol w:w="1820"/>
+      </w:tblGrid>
+      <w:tr>
+        <w:tc>
+          <w:tcPr>
+            <w:tcW w:type="dxa" w:w="1152"/>
+            <w:shd w:fill="1E3A8A"/>
+            <w:tcMar>
+              <w:top w:w="100" w:type="dxa"/>
+              <w:bottom w:w="100" w:type="dxa"/>
+              <w:left w:w="120" w:type="dxa"/>
+              <w:right w:w="120" w:type="dxa"/>
+            </w:tcMar>
+          </w:tcPr>
+          <w:p>
+            <w:pPr>
+              <w:jc w:val="center"/>
+            </w:pPr>
+            <w:r>
+              <w:rPr>
+                <w:rFonts w:ascii="Times New Roman" w:hAnsi="Times New Roman"/>
+                <w:b/>
+                <w:color w:val="FFFFFF"/>
+                <w:sz w:val="20"/>
+              </w:rPr>
+              <w:t>Kode FR</w:t>
+            </w:r>
+          </w:p>
+        </w:tc>
+        <w:tc>
+          <w:tcPr>
+            <w:tcW w:type="dxa" w:w="2016"/>
+            <w:shd w:fill="1E3A8A"/>
+            <w:tcMar>
+              <w:top w:w="100" w:type="dxa"/>
+              <w:bottom w:w="100" w:type="dxa"/>
+              <w:left w:w="120" w:type="dxa"/>
+              <w:right w:w="120" w:type="dxa"/>
+            </w:tcMar>
+          </w:tcPr>
+          <w:p>
+            <w:pPr>
+              <w:jc w:val="center"/>
+            </w:pPr>
+            <w:r>
+              <w:rPr>
+                <w:rFonts w:ascii="Times New Roman" w:hAnsi="Times New Roman"/>
+                <w:b/>
+                <w:color w:val="FFFFFF"/>
+                <w:sz w:val="20"/>
+              </w:rPr>
+              <w:t>Nama Fitur</w:t>
+            </w:r>
+          </w:p>
+        </w:tc>
+        <w:tc>
+          <w:tcPr>
+            <w:tcW w:type="dxa" w:w="1872"/>
+            <w:shd w:fill="1E3A8A"/>
+            <w:tcMar>
+              <w:top w:w="100" w:type="dxa"/>
+              <w:bottom w:w="100" w:type="dxa"/>
+              <w:left w:w="120" w:type="dxa"/>
+              <w:right w:w="120" w:type="dxa"/>
+            </w:tcMar>
+          </w:tcPr>
+          <w:p>
+            <w:pPr>
+              <w:jc w:val="center"/>
+            </w:pPr>
+            <w:r>
+              <w:rPr>
+                <w:rFonts w:ascii="Times New Roman" w:hAnsi="Times New Roman"/>
+                <w:b/>
+                <w:color w:val="FFFFFF"/>
+                <w:sz w:val="20"/>
+              </w:rPr>
+              <w:t>Aktor Pelaksana</w:t>
+            </w:r>
+          </w:p>
+        </w:tc>
+        <w:tc>
+          <w:tcPr>
+            <w:tcW w:type="dxa" w:w="3312"/>
+            <w:shd w:fill="1E3A8A"/>
+            <w:tcMar>
+              <w:top w:w="100" w:type="dxa"/>
+              <w:bottom w:w="100" w:type="dxa"/>
+              <w:left w:w="120" w:type="dxa"/>
+              <w:right w:w="120" w:type="dxa"/>
+            </w:tcMar>
+          </w:tcPr>
+          <w:p>
+            <w:pPr>
+              <w:jc w:val="center"/>
+            </w:pPr>
+            <w:r>
+              <w:rPr>
+                <w:rFonts w:ascii="Times New Roman" w:hAnsi="Times New Roman"/>
+                <w:b/>
+                <w:color w:val="FFFFFF"/>
+                <w:sz w:val="20"/>
+              </w:rPr>
+              <w:t>Deskripsi Fungsional</w:t>
+            </w:r>
+          </w:p>
+        </w:tc>
+        <w:tc>
+          <w:tcPr>
+            <w:tcW w:type="dxa" w:w="1008"/>
+            <w:shd w:fill="1E3A8A"/>
+            <w:tcMar>
+              <w:top w:w="100" w:type="dxa"/>
+              <w:bottom w:w="100" w:type="dxa"/>
+              <w:left w:w="120" w:type="dxa"/>
+              <w:right w:w="120" w:type="dxa"/>
+            </w:tcMar>
+          </w:tcPr>
+          <w:p>
+            <w:pPr>
+              <w:jc w:val="center"/>
+            </w:pPr>
+            <w:r>
+              <w:rPr>
+                <w:rFonts w:ascii="Times New Roman" w:hAnsi="Times New Roman"/>
+                <w:b/>
+                <w:color w:val="FFFFFF"/>
+                <w:sz w:val="20"/>
+              </w:rPr>
+              <w:t>Prioritas</w:t>
+            </w:r>
+          </w:p>
+        </w:tc>
+      </w:tr>
+      <w:tr>
+        <w:tc>
+          <w:tcPr>
+            <w:tcW w:type="dxa" w:w="1152"/>
+            <w:shd w:fill="FFFFFF"/>
+            <w:tcMar>
+              <w:top w:w="80" w:type="dxa"/>
+              <w:bottom w:w="80" w:type="dxa"/>
+              <w:left w:w="120" w:type="dxa"/>
+              <w:right w:w="120" w:type="dxa"/>
+            </w:tcMar>
+          </w:tcPr>
+          <w:p>
+            <w:pPr>
+              <w:jc w:val="center"/>
+            </w:pPr>
+            <w:r>
+              <w:rPr>
+                <w:rFonts w:ascii="Times New Roman" w:hAnsi="Times New Roman"/>
+                <w:sz w:val="19"/>
+              </w:rPr>
+              <w:t>FR-01</w:t>
+            </w:r>
+          </w:p>
+        </w:tc>
+        <w:tc>
+          <w:tcPr>
+            <w:tcW w:type="dxa" w:w="2016"/>
+            <w:shd w:fill="FFFFFF"/>
+            <w:tcMar>
+              <w:top w:w="80" w:type="dxa"/>
+              <w:bottom w:w="80" w:type="dxa"/>
+              <w:left w:w="120" w:type="dxa"/>
+              <w:right w:w="120" w:type="dxa"/>
+            </w:tcMar>
+          </w:tcPr>
+          <w:p>
+            <w:pPr>
+              <w:jc w:val="left"/>
+            </w:pPr>
+            <w:r>
+              <w:rPr>
+                <w:rFonts w:ascii="Times New Roman" w:hAnsi="Times New Roman"/>
+                <w:sz w:val="19"/>
+              </w:rPr>
+              <w:t>Otentikasi Pengguna</w:t>
+            </w:r>
+          </w:p>
+        </w:tc>
+        <w:tc>
+          <w:tcPr>
+            <w:tcW w:type="dxa" w:w="1872"/>
+            <w:shd w:fill="FFFFFF"/>
+            <w:tcMar>
+              <w:top w:w="80" w:type="dxa"/>
+              <w:bottom w:w="80" w:type="dxa"/>
+              <w:left w:w="120" w:type="dxa"/>
+              <w:right w:w="120" w:type="dxa"/>
+            </w:tcMar>
+          </w:tcPr>
+          <w:p>
+            <w:pPr>
+              <w:jc w:val="left"/>
+            </w:pPr>
+            <w:r>
+              <w:rPr>
+                <w:rFonts w:ascii="Times New Roman" w:hAnsi="Times New Roman"/>
+                <w:sz w:val="19"/>
+              </w:rPr>
+              <w:t>Mahasiswa &amp; Laboran</w:t>
+            </w:r>
+          </w:p>
+        </w:tc>
+        <w:tc>
+          <w:tcPr>
+            <w:tcW w:type="dxa" w:w="3312"/>
+            <w:shd w:fill="FFFFFF"/>
+            <w:tcMar>
+              <w:top w:w="80" w:type="dxa"/>
+              <w:bottom w:w="80" w:type="dxa"/>
+              <w:left w:w="120" w:type="dxa"/>
+              <w:right w:w="120" w:type="dxa"/>
+            </w:tcMar>
+          </w:tcPr>
+          <w:p>
+            <w:pPr>
+              <w:jc w:val="left"/>
+            </w:pPr>
+            <w:r>
+              <w:rPr>
+                <w:rFonts w:ascii="Times New Roman" w:hAnsi="Times New Roman"/>
+                <w:sz w:val="19"/>
+              </w:rPr>
+              <w:t>Masuk ke sistem dengan email &amp; password terenkripsi via Supabase Auth.</w:t>
+            </w:r>
+          </w:p>
+        </w:tc>
+        <w:tc>
+          <w:tcPr>
+            <w:tcW w:type="dxa" w:w="1008"/>
+            <w:shd w:fill="FFFFFF"/>
+            <w:tcMar>
+              <w:top w:w="80" w:type="dxa"/>
+              <w:bottom w:w="80" w:type="dxa"/>
+              <w:left w:w="120" w:type="dxa"/>
+              <w:right w:w="120" w:type="dxa"/>
+            </w:tcMar>
+          </w:tcPr>
+          <w:p>
+            <w:pPr>
+              <w:jc w:val="left"/>
+            </w:pPr>
+            <w:r>
+              <w:rPr>
+                <w:rFonts w:ascii="Times New Roman" w:hAnsi="Times New Roman"/>
+                <w:sz w:val="19"/>
+              </w:rPr>
+              <w:t>Tinggi</w:t>
+            </w:r>
+          </w:p>
+        </w:tc>
+      </w:tr>
+      <w:tr>
+        <w:tc>
+          <w:tcPr>
+            <w:tcW w:type="dxa" w:w="1152"/>
+            <w:shd w:fill="F1F5F9"/>
+            <w:tcMar>
+              <w:top w:w="80" w:type="dxa"/>
+              <w:bottom w:w="80" w:type="dxa"/>
+              <w:left w:w="120" w:type="dxa"/>
+              <w:right w:w="120" w:type="dxa"/>
+            </w:tcMar>
+          </w:tcPr>
+          <w:p>
+            <w:pPr>
+              <w:jc w:val="center"/>
+            </w:pPr>
+            <w:r>
+              <w:rPr>
+                <w:rFonts w:ascii="Times New Roman" w:hAnsi="Times New Roman"/>
+                <w:sz w:val="19"/>
+              </w:rPr>
+              <w:t>FR-02</w:t>
+            </w:r>
+          </w:p>
+        </w:tc>
+        <w:tc>
+          <w:tcPr>
+            <w:tcW w:type="dxa" w:w="2016"/>
+            <w:shd w:fill="F1F5F9"/>
+            <w:tcMar>
+              <w:top w:w="80" w:type="dxa"/>
+              <w:bottom w:w="80" w:type="dxa"/>
+              <w:left w:w="120" w:type="dxa"/>
+              <w:right w:w="120" w:type="dxa"/>
+            </w:tcMar>
+          </w:tcPr>
+          <w:p>
+            <w:pPr>
+              <w:jc w:val="left"/>
+            </w:pPr>
+            <w:r>
+              <w:rPr>
+                <w:rFonts w:ascii="Times New Roman" w:hAnsi="Times New Roman"/>
+                <w:sz w:val="19"/>
+              </w:rPr>
+              <w:t>Pemisahan Hak Akses Role</w:t>
+            </w:r>
+          </w:p>
+        </w:tc>
+        <w:tc>
+          <w:tcPr>
+            <w:tcW w:type="dxa" w:w="1872"/>
+            <w:shd w:fill="F1F5F9"/>
+            <w:tcMar>
+              <w:top w:w="80" w:type="dxa"/>
+              <w:bottom w:w="80" w:type="dxa"/>
+              <w:left w:w="120" w:type="dxa"/>
+              <w:right w:w="120" w:type="dxa"/>
+            </w:tcMar>
+          </w:tcPr>
+          <w:p>
+            <w:pPr>
+              <w:jc w:val="left"/>
+            </w:pPr>
+            <w:r>
+              <w:rPr>
+                <w:rFonts w:ascii="Times New Roman" w:hAnsi="Times New Roman"/>
+                <w:sz w:val="19"/>
+              </w:rPr>
+              <w:t>Sistem</w:t>
+            </w:r>
+          </w:p>
+        </w:tc>
+        <w:tc>
+          <w:tcPr>
+            <w:tcW w:type="dxa" w:w="3312"/>
+            <w:shd w:fill="F1F5F9"/>
+            <w:tcMar>
+              <w:top w:w="80" w:type="dxa"/>
+              <w:bottom w:w="80" w:type="dxa"/>
+              <w:left w:w="120" w:type="dxa"/>
+              <w:right w:w="120" w:type="dxa"/>
+            </w:tcMar>
+          </w:tcPr>
+          <w:p>
+            <w:pPr>
+              <w:jc w:val="left"/>
+            </w:pPr>
+            <w:r>
+              <w:rPr>
+                <w:rFonts w:ascii="Times New Roman" w:hAnsi="Times New Roman"/>
+                <w:sz w:val="19"/>
+              </w:rPr>
+              <w:t>Mengarahkan antarmuka (dashboard) sesuai role pengguna (Mahasiswa vs Laboran).</w:t>
+            </w:r>
+          </w:p>
+        </w:tc>
+        <w:tc>
+          <w:tcPr>
+            <w:tcW w:type="dxa" w:w="1008"/>
+            <w:shd w:fill="F1F5F9"/>
+            <w:tcMar>
+              <w:top w:w="80" w:type="dxa"/>
+              <w:bottom w:w="80" w:type="dxa"/>
+              <w:left w:w="120" w:type="dxa"/>
+              <w:right w:w="120" w:type="dxa"/>
+            </w:tcMar>
+          </w:tcPr>
+          <w:p>
+            <w:pPr>
+              <w:jc w:val="left"/>
+            </w:pPr>
+            <w:r>
+              <w:rPr>
+                <w:rFonts w:ascii="Times New Roman" w:hAnsi="Times New Roman"/>
+                <w:sz w:val="19"/>
+              </w:rPr>
+              <w:t>Tinggi</w:t>
+            </w:r>
+          </w:p>
+        </w:tc>
+      </w:tr>
+      <w:tr>
+        <w:tc>
+          <w:tcPr>
+            <w:tcW w:type="dxa" w:w="1152"/>
+            <w:shd w:fill="FFFFFF"/>
+            <w:tcMar>
+              <w:top w:w="80" w:type="dxa"/>
+              <w:bottom w:w="80" w:type="dxa"/>
+              <w:left w:w="120" w:type="dxa"/>
+              <w:right w:w="120" w:type="dxa"/>
+            </w:tcMar>
+          </w:tcPr>
+          <w:p>
+            <w:pPr>
+              <w:jc w:val="center"/>
+            </w:pPr>
+            <w:r>
+              <w:rPr>
+                <w:rFonts w:ascii="Times New Roman" w:hAnsi="Times New Roman"/>
+                <w:sz w:val="19"/>
+              </w:rPr>
+              <w:t>FR-03</w:t>
+            </w:r>
+          </w:p>
+        </w:tc>
+        <w:tc>
+          <w:tcPr>
+            <w:tcW w:type="dxa" w:w="2016"/>
+            <w:shd w:fill="FFFFFF"/>
+            <w:tcMar>
+              <w:top w:w="80" w:type="dxa"/>
+              <w:bottom w:w="80" w:type="dxa"/>
+              <w:left w:w="120" w:type="dxa"/>
+              <w:right w:w="120" w:type="dxa"/>
+            </w:tcMar>
+          </w:tcPr>
+          <w:p>
+            <w:pPr>
+              <w:jc w:val="left"/>
+            </w:pPr>
+            <w:r>
+              <w:rPr>
+                <w:rFonts w:ascii="Times New Roman" w:hAnsi="Times New Roman"/>
+                <w:sz w:val="19"/>
+              </w:rPr>
+              <w:t>Katalog &amp; Pencarian Barang</w:t>
+            </w:r>
+          </w:p>
+        </w:tc>
+        <w:tc>
+          <w:tcPr>
+            <w:tcW w:type="dxa" w:w="1872"/>
+            <w:shd w:fill="FFFFFF"/>
+            <w:tcMar>
+              <w:top w:w="80" w:type="dxa"/>
+              <w:bottom w:w="80" w:type="dxa"/>
+              <w:left w:w="120" w:type="dxa"/>
+              <w:right w:w="120" w:type="dxa"/>
+            </w:tcMar>
+          </w:tcPr>
+          <w:p>
+            <w:pPr>
+              <w:jc w:val="left"/>
+            </w:pPr>
+            <w:r>
+              <w:rPr>
+                <w:rFonts w:ascii="Times New Roman" w:hAnsi="Times New Roman"/>
+                <w:sz w:val="19"/>
+              </w:rPr>
+              <w:t>Mahasiswa</w:t>
+            </w:r>
+          </w:p>
+        </w:tc>
+        <w:tc>
+          <w:tcPr>
+            <w:tcW w:type="dxa" w:w="3312"/>
+            <w:shd w:fill="FFFFFF"/>
+            <w:tcMar>
+              <w:top w:w="80" w:type="dxa"/>
+              <w:bottom w:w="80" w:type="dxa"/>
+              <w:left w:w="120" w:type="dxa"/>
+              <w:right w:w="120" w:type="dxa"/>
+            </w:tcMar>
+          </w:tcPr>
+          <w:p>
+            <w:pPr>
+              <w:jc w:val="left"/>
+            </w:pPr>
+            <w:r>
+              <w:rPr>
+                <w:rFonts w:ascii="Times New Roman" w:hAnsi="Times New Roman"/>
+                <w:sz w:val="19"/>
+              </w:rPr>
+              <w:t>Menampilkan daftar alat lab, sisa stok realtime, dan filter pencarian nama barang.</w:t>
+            </w:r>
+          </w:p>
+        </w:tc>
+        <w:tc>
+          <w:tcPr>
+            <w:tcW w:type="dxa" w:w="1008"/>
+            <w:shd w:fill="FFFFFF"/>
+            <w:tcMar>
+              <w:top w:w="80" w:type="dxa"/>
+              <w:bottom w:w="80" w:type="dxa"/>
+              <w:left w:w="120" w:type="dxa"/>
+              <w:right w:w="120" w:type="dxa"/>
+            </w:tcMar>
+          </w:tcPr>
+          <w:p>
+            <w:pPr>
+              <w:jc w:val="left"/>
+            </w:pPr>
+            <w:r>
+              <w:rPr>
+                <w:rFonts w:ascii="Times New Roman" w:hAnsi="Times New Roman"/>
+                <w:sz w:val="19"/>
+              </w:rPr>
+              <w:t>Tinggi</w:t>
+            </w:r>
+          </w:p>
+        </w:tc>
+      </w:tr>
+      <w:tr>
+        <w:tc>
+          <w:tcPr>
+            <w:tcW w:type="dxa" w:w="1152"/>
+            <w:shd w:fill="F1F5F9"/>
+            <w:tcMar>
+              <w:top w:w="80" w:type="dxa"/>
+              <w:bottom w:w="80" w:type="dxa"/>
+              <w:left w:w="120" w:type="dxa"/>
+              <w:right w:w="120" w:type="dxa"/>
+            </w:tcMar>
+          </w:tcPr>
+          <w:p>
+            <w:pPr>
+              <w:jc w:val="center"/>
+            </w:pPr>
+            <w:r>
+              <w:rPr>
+                <w:rFonts w:ascii="Times New Roman" w:hAnsi="Times New Roman"/>
+                <w:sz w:val="19"/>
+              </w:rPr>
+              <w:t>FR-04</w:t>
+            </w:r>
+          </w:p>
+        </w:tc>
+        <w:tc>
+          <w:tcPr>
+            <w:tcW w:type="dxa" w:w="2016"/>
+            <w:shd w:fill="F1F5F9"/>
+            <w:tcMar>
+              <w:top w:w="80" w:type="dxa"/>
+              <w:bottom w:w="80" w:type="dxa"/>
+              <w:left w:w="120" w:type="dxa"/>
+              <w:right w:w="120" w:type="dxa"/>
+            </w:tcMar>
+          </w:tcPr>
+          <w:p>
+            <w:pPr>
+              <w:jc w:val="left"/>
+            </w:pPr>
+            <w:r>
+              <w:rPr>
+                <w:rFonts w:ascii="Times New Roman" w:hAnsi="Times New Roman"/>
+                <w:sz w:val="19"/>
+              </w:rPr>
+              <w:t>Pengajuan Formulir Pinjam</w:t>
+            </w:r>
+          </w:p>
+        </w:tc>
+        <w:tc>
+          <w:tcPr>
+            <w:tcW w:type="dxa" w:w="1872"/>
+            <w:shd w:fill="F1F5F9"/>
+            <w:tcMar>
+              <w:top w:w="80" w:type="dxa"/>
+              <w:bottom w:w="80" w:type="dxa"/>
+              <w:left w:w="120" w:type="dxa"/>
+              <w:right w:w="120" w:type="dxa"/>
+            </w:tcMar>
+          </w:tcPr>
+          <w:p>
+            <w:pPr>
+              <w:jc w:val="left"/>
+            </w:pPr>
+            <w:r>
+              <w:rPr>
+                <w:rFonts w:ascii="Times New Roman" w:hAnsi="Times New Roman"/>
+                <w:sz w:val="19"/>
+              </w:rPr>
+              <w:t>Mahasiswa</w:t>
+            </w:r>
+          </w:p>
+        </w:tc>
+        <w:tc>
+          <w:tcPr>
+            <w:tcW w:type="dxa" w:w="3312"/>
+            <w:shd w:fill="F1F5F9"/>
+            <w:tcMar>
+              <w:top w:w="80" w:type="dxa"/>
+              <w:bottom w:w="80" w:type="dxa"/>
+              <w:left w:w="120" w:type="dxa"/>
+              <w:right w:w="120" w:type="dxa"/>
+            </w:tcMar>
+          </w:tcPr>
+          <w:p>
+            <w:pPr>
+              <w:jc w:val="left"/>
+            </w:pPr>
+            <w:r>
+              <w:rPr>
+                <w:rFonts w:ascii="Times New Roman" w:hAnsi="Times New Roman"/>
+                <w:sz w:val="19"/>
+              </w:rPr>
+              <w:t>Menginput jumlah pinjam, memilih tanggal WIB, dan mencantumkan keperluan praktikum.</w:t>
+            </w:r>
+          </w:p>
+        </w:tc>
+        <w:tc>
+          <w:tcPr>
+            <w:tcW w:type="dxa" w:w="1008"/>
+            <w:shd w:fill="F1F5F9"/>
+            <w:tcMar>
+              <w:top w:w="80" w:type="dxa"/>
+              <w:bottom w:w="80" w:type="dxa"/>
+              <w:left w:w="120" w:type="dxa"/>
+              <w:right w:w="120" w:type="dxa"/>
+            </w:tcMar>
+          </w:tcPr>
+          <w:p>
+            <w:pPr>
+              <w:jc w:val="left"/>
+            </w:pPr>
+            <w:r>
+              <w:rPr>
+                <w:rFonts w:ascii="Times New Roman" w:hAnsi="Times New Roman"/>
+                <w:sz w:val="19"/>
+              </w:rPr>
+              <w:t>Tinggi</w:t>
+            </w:r>
+          </w:p>
+        </w:tc>
+      </w:tr>
+      <w:tr>
+        <w:tc>
+          <w:tcPr>
+            <w:tcW w:type="dxa" w:w="1152"/>
+            <w:shd w:fill="FFFFFF"/>
+            <w:tcMar>
+              <w:top w:w="80" w:type="dxa"/>
+              <w:bottom w:w="80" w:type="dxa"/>
+              <w:left w:w="120" w:type="dxa"/>
+              <w:right w:w="120" w:type="dxa"/>
+            </w:tcMar>
+          </w:tcPr>
+          <w:p>
+            <w:pPr>
+              <w:jc w:val="center"/>
+            </w:pPr>
+            <w:r>
+              <w:rPr>
+                <w:rFonts w:ascii="Times New Roman" w:hAnsi="Times New Roman"/>
+                <w:sz w:val="19"/>
+              </w:rPr>
+              <w:t>FR-05</w:t>
+            </w:r>
+          </w:p>
+        </w:tc>
+        <w:tc>
+          <w:tcPr>
+            <w:tcW w:type="dxa" w:w="2016"/>
+            <w:shd w:fill="FFFFFF"/>
+            <w:tcMar>
+              <w:top w:w="80" w:type="dxa"/>
+              <w:bottom w:w="80" w:type="dxa"/>
+              <w:left w:w="120" w:type="dxa"/>
+              <w:right w:w="120" w:type="dxa"/>
+            </w:tcMar>
+          </w:tcPr>
+          <w:p>
+            <w:pPr>
+              <w:jc w:val="left"/>
+            </w:pPr>
+            <w:r>
+              <w:rPr>
+                <w:rFonts w:ascii="Times New Roman" w:hAnsi="Times New Roman"/>
+                <w:sz w:val="19"/>
+              </w:rPr>
+              <w:t>Persetujuan Tiket Peminjaman</w:t>
+            </w:r>
+          </w:p>
+        </w:tc>
+        <w:tc>
+          <w:tcPr>
+            <w:tcW w:type="dxa" w:w="1872"/>
+            <w:shd w:fill="FFFFFF"/>
+            <w:tcMar>
+              <w:top w:w="80" w:type="dxa"/>
+              <w:bottom w:w="80" w:type="dxa"/>
+              <w:left w:w="120" w:type="dxa"/>
+              <w:right w:w="120" w:type="dxa"/>
+            </w:tcMar>
+          </w:tcPr>
+          <w:p>
+            <w:pPr>
+              <w:jc w:val="left"/>
+            </w:pPr>
+            <w:r>
+              <w:rPr>
+                <w:rFonts w:ascii="Times New Roman" w:hAnsi="Times New Roman"/>
+                <w:sz w:val="19"/>
+              </w:rPr>
+              <w:t>Laboran</w:t>
+            </w:r>
+          </w:p>
+        </w:tc>
+        <w:tc>
+          <w:tcPr>
+            <w:tcW w:type="dxa" w:w="3312"/>
+            <w:shd w:fill="FFFFFF"/>
+            <w:tcMar>
+              <w:top w:w="80" w:type="dxa"/>
+              <w:bottom w:w="80" w:type="dxa"/>
+              <w:left w:w="120" w:type="dxa"/>
+              <w:right w:w="120" w:type="dxa"/>
+            </w:tcMar>
+          </w:tcPr>
+          <w:p>
+            <w:pPr>
+              <w:jc w:val="left"/>
+            </w:pPr>
+            <w:r>
+              <w:rPr>
+                <w:rFonts w:ascii="Times New Roman" w:hAnsi="Times New Roman"/>
+                <w:sz w:val="19"/>
+              </w:rPr>
+              <w:t>Memverifikasi tiket status pending, memeriksa KTM fisik mahasiswa, dan approval.</w:t>
+            </w:r>
+          </w:p>
+        </w:tc>
+        <w:tc>
+          <w:tcPr>
+            <w:tcW w:type="dxa" w:w="1008"/>
+            <w:shd w:fill="FFFFFF"/>
+            <w:tcMar>
+              <w:top w:w="80" w:type="dxa"/>
+              <w:bottom w:w="80" w:type="dxa"/>
+              <w:left w:w="120" w:type="dxa"/>
+              <w:right w:w="120" w:type="dxa"/>
+            </w:tcMar>
+          </w:tcPr>
+          <w:p>
+            <w:pPr>
+              <w:jc w:val="left"/>
+            </w:pPr>
+            <w:r>
+              <w:rPr>
+                <w:rFonts w:ascii="Times New Roman" w:hAnsi="Times New Roman"/>
+                <w:sz w:val="19"/>
+              </w:rPr>
+              <w:t>Tinggi</w:t>
+            </w:r>
+          </w:p>
+        </w:tc>
+      </w:tr>
+      <w:tr>
+        <w:tc>
+          <w:tcPr>
+            <w:tcW w:type="dxa" w:w="1152"/>
+            <w:shd w:fill="F1F5F9"/>
+            <w:tcMar>
+              <w:top w:w="80" w:type="dxa"/>
+              <w:bottom w:w="80" w:type="dxa"/>
+              <w:left w:w="120" w:type="dxa"/>
+              <w:right w:w="120" w:type="dxa"/>
+            </w:tcMar>
+          </w:tcPr>
+          <w:p>
+            <w:pPr>
+              <w:jc w:val="center"/>
+            </w:pPr>
+            <w:r>
+              <w:rPr>
+                <w:rFonts w:ascii="Times New Roman" w:hAnsi="Times New Roman"/>
+                <w:sz w:val="19"/>
+              </w:rPr>
+              <w:t>FR-06</w:t>
+            </w:r>
+          </w:p>
+        </w:tc>
+        <w:tc>
+          <w:tcPr>
+            <w:tcW w:type="dxa" w:w="2016"/>
+            <w:shd w:fill="F1F5F9"/>
+            <w:tcMar>
+              <w:top w:w="80" w:type="dxa"/>
+              <w:bottom w:w="80" w:type="dxa"/>
+              <w:left w:w="120" w:type="dxa"/>
+              <w:right w:w="120" w:type="dxa"/>
+            </w:tcMar>
+          </w:tcPr>
+          <w:p>
+            <w:pPr>
+              <w:jc w:val="left"/>
+            </w:pPr>
+            <w:r>
+              <w:rPr>
+                <w:rFonts w:ascii="Times New Roman" w:hAnsi="Times New Roman"/>
+                <w:sz w:val="19"/>
+              </w:rPr>
+              <w:t>Pengembalian &amp; Cek Fisik</w:t>
+            </w:r>
+          </w:p>
+        </w:tc>
+        <w:tc>
+          <w:tcPr>
+            <w:tcW w:type="dxa" w:w="1872"/>
+            <w:shd w:fill="F1F5F9"/>
+            <w:tcMar>
+              <w:top w:w="80" w:type="dxa"/>
+              <w:bottom w:w="80" w:type="dxa"/>
+              <w:left w:w="120" w:type="dxa"/>
+              <w:right w:w="120" w:type="dxa"/>
+            </w:tcMar>
+          </w:tcPr>
+          <w:p>
+            <w:pPr>
+              <w:jc w:val="left"/>
+            </w:pPr>
+            <w:r>
+              <w:rPr>
+                <w:rFonts w:ascii="Times New Roman" w:hAnsi="Times New Roman"/>
+                <w:sz w:val="19"/>
+              </w:rPr>
+              <w:t>Laboran</w:t>
+            </w:r>
+          </w:p>
+        </w:tc>
+        <w:tc>
+          <w:tcPr>
+            <w:tcW w:type="dxa" w:w="3312"/>
+            <w:shd w:fill="F1F5F9"/>
+            <w:tcMar>
+              <w:top w:w="80" w:type="dxa"/>
+              <w:bottom w:w="80" w:type="dxa"/>
+              <w:left w:w="120" w:type="dxa"/>
+              <w:right w:w="120" w:type="dxa"/>
+            </w:tcMar>
+          </w:tcPr>
+          <w:p>
+            <w:pPr>
+              <w:jc w:val="left"/>
+            </w:pPr>
+            <w:r>
+              <w:rPr>
+                <w:rFonts w:ascii="Times New Roman" w:hAnsi="Times New Roman"/>
+                <w:sz w:val="19"/>
+              </w:rPr>
+              <w:t>Memeriksa kondisi fisik alat (Baik/Rusak), input catatan, dan konfirmasi kembali.</w:t>
+            </w:r>
+          </w:p>
+        </w:tc>
+        <w:tc>
+          <w:tcPr>
+            <w:tcW w:type="dxa" w:w="1008"/>
+            <w:shd w:fill="F1F5F9"/>
+            <w:tcMar>
+              <w:top w:w="80" w:type="dxa"/>
+              <w:bottom w:w="80" w:type="dxa"/>
+              <w:left w:w="120" w:type="dxa"/>
+              <w:right w:w="120" w:type="dxa"/>
+            </w:tcMar>
+          </w:tcPr>
+          <w:p>
+            <w:pPr>
+              <w:jc w:val="left"/>
+            </w:pPr>
+            <w:r>
+              <w:rPr>
+                <w:rFonts w:ascii="Times New Roman" w:hAnsi="Times New Roman"/>
+                <w:sz w:val="19"/>
+              </w:rPr>
+              <w:t>Tinggi</w:t>
+            </w:r>
+          </w:p>
+        </w:tc>
+      </w:tr>
+      <w:tr>
+        <w:tc>
+          <w:tcPr>
+            <w:tcW w:type="dxa" w:w="1152"/>
+            <w:shd w:fill="FFFFFF"/>
+            <w:tcMar>
+              <w:top w:w="80" w:type="dxa"/>
+              <w:bottom w:w="80" w:type="dxa"/>
+              <w:left w:w="120" w:type="dxa"/>
+              <w:right w:w="120" w:type="dxa"/>
+            </w:tcMar>
+          </w:tcPr>
+          <w:p>
+            <w:pPr>
+              <w:jc w:val="center"/>
+            </w:pPr>
+            <w:r>
+              <w:rPr>
+                <w:rFonts w:ascii="Times New Roman" w:hAnsi="Times New Roman"/>
+                <w:sz w:val="19"/>
+              </w:rPr>
+              <w:t>FR-07</w:t>
+            </w:r>
+          </w:p>
+        </w:tc>
+        <w:tc>
+          <w:tcPr>
+            <w:tcW w:type="dxa" w:w="2016"/>
+            <w:shd w:fill="FFFFFF"/>
+            <w:tcMar>
+              <w:top w:w="80" w:type="dxa"/>
+              <w:bottom w:w="80" w:type="dxa"/>
+              <w:left w:w="120" w:type="dxa"/>
+              <w:right w:w="120" w:type="dxa"/>
+            </w:tcMar>
+          </w:tcPr>
+          <w:p>
+            <w:pPr>
+              <w:jc w:val="left"/>
+            </w:pPr>
+            <w:r>
+              <w:rPr>
+                <w:rFonts w:ascii="Times New Roman" w:hAnsi="Times New Roman"/>
+                <w:sz w:val="19"/>
+              </w:rPr>
+              <w:t>Pelacakan Riwayat Transaksi</w:t>
+            </w:r>
+          </w:p>
+        </w:tc>
+        <w:tc>
+          <w:tcPr>
+            <w:tcW w:type="dxa" w:w="1872"/>
+            <w:shd w:fill="FFFFFF"/>
+            <w:tcMar>
+              <w:top w:w="80" w:type="dxa"/>
+              <w:bottom w:w="80" w:type="dxa"/>
+              <w:left w:w="120" w:type="dxa"/>
+              <w:right w:w="120" w:type="dxa"/>
+            </w:tcMar>
+          </w:tcPr>
+          <w:p>
+            <w:pPr>
+              <w:jc w:val="left"/>
+            </w:pPr>
+            <w:r>
+              <w:rPr>
+                <w:rFonts w:ascii="Times New Roman" w:hAnsi="Times New Roman"/>
+                <w:sz w:val="19"/>
+              </w:rPr>
+              <w:t>Mahasiswa &amp; Laboran</w:t>
+            </w:r>
+          </w:p>
+        </w:tc>
+        <w:tc>
+          <w:tcPr>
+            <w:tcW w:type="dxa" w:w="3312"/>
+            <w:shd w:fill="FFFFFF"/>
+            <w:tcMar>
+              <w:top w:w="80" w:type="dxa"/>
+              <w:bottom w:w="80" w:type="dxa"/>
+              <w:left w:w="120" w:type="dxa"/>
+              <w:right w:w="120" w:type="dxa"/>
+            </w:tcMar>
+          </w:tcPr>
+          <w:p>
+            <w:pPr>
+              <w:jc w:val="left"/>
+            </w:pPr>
+            <w:r>
+              <w:rPr>
+                <w:rFonts w:ascii="Times New Roman" w:hAnsi="Times New Roman"/>
+                <w:sz w:val="19"/>
+              </w:rPr>
+              <w:t>Melihat riwayat peminjaman masa lalu beserta status akhir barang secara kronologis.</w:t>
+            </w:r>
+          </w:p>
+        </w:tc>
+        <w:tc>
+          <w:tcPr>
+            <w:tcW w:type="dxa" w:w="1008"/>
+            <w:shd w:fill="FFFFFF"/>
+            <w:tcMar>
+              <w:top w:w="80" w:type="dxa"/>
+              <w:bottom w:w="80" w:type="dxa"/>
+              <w:left w:w="120" w:type="dxa"/>
+              <w:right w:w="120" w:type="dxa"/>
+            </w:tcMar>
+          </w:tcPr>
+          <w:p>
+            <w:pPr>
+              <w:jc w:val="left"/>
+            </w:pPr>
+            <w:r>
+              <w:rPr>
+                <w:rFonts w:ascii="Times New Roman" w:hAnsi="Times New Roman"/>
+                <w:sz w:val="19"/>
+              </w:rPr>
+              <w:t>Sedang</w:t>
+            </w:r>
+          </w:p>
+        </w:tc>
+      </w:tr>
+      <w:tr>
+        <w:tc>
+          <w:tcPr>
+            <w:tcW w:type="dxa" w:w="1152"/>
+            <w:shd w:fill="F1F5F9"/>
+            <w:tcMar>
+              <w:top w:w="80" w:type="dxa"/>
+              <w:bottom w:w="80" w:type="dxa"/>
+              <w:left w:w="120" w:type="dxa"/>
+              <w:right w:w="120" w:type="dxa"/>
+            </w:tcMar>
+          </w:tcPr>
+          <w:p>
+            <w:pPr>
+              <w:jc w:val="center"/>
+            </w:pPr>
+            <w:r>
+              <w:rPr>
+                <w:rFonts w:ascii="Times New Roman" w:hAnsi="Times New Roman"/>
+                <w:sz w:val="19"/>
+              </w:rPr>
+              <w:t>FR-08</w:t>
+            </w:r>
+          </w:p>
+        </w:tc>
+        <w:tc>
+          <w:tcPr>
+            <w:tcW w:type="dxa" w:w="2016"/>
+            <w:shd w:fill="F1F5F9"/>
+            <w:tcMar>
+              <w:top w:w="80" w:type="dxa"/>
+              <w:bottom w:w="80" w:type="dxa"/>
+              <w:left w:w="120" w:type="dxa"/>
+              <w:right w:w="120" w:type="dxa"/>
+            </w:tcMar>
+          </w:tcPr>
+          <w:p>
+            <w:pPr>
+              <w:jc w:val="left"/>
+            </w:pPr>
+            <w:r>
+              <w:rPr>
+                <w:rFonts w:ascii="Times New Roman" w:hAnsi="Times New Roman"/>
+                <w:sz w:val="19"/>
+              </w:rPr>
+              <w:t>Manajemen Master Barang</w:t>
+            </w:r>
+          </w:p>
+        </w:tc>
+        <w:tc>
+          <w:tcPr>
+            <w:tcW w:type="dxa" w:w="1872"/>
+            <w:shd w:fill="F1F5F9"/>
+            <w:tcMar>
+              <w:top w:w="80" w:type="dxa"/>
+              <w:bottom w:w="80" w:type="dxa"/>
+              <w:left w:w="120" w:type="dxa"/>
+              <w:right w:w="120" w:type="dxa"/>
+            </w:tcMar>
+          </w:tcPr>
+          <w:p>
+            <w:pPr>
+              <w:jc w:val="left"/>
+            </w:pPr>
+            <w:r>
+              <w:rPr>
+                <w:rFonts w:ascii="Times New Roman" w:hAnsi="Times New Roman"/>
+                <w:sz w:val="19"/>
+              </w:rPr>
+              <w:t>Laboran</w:t>
+            </w:r>
+          </w:p>
+        </w:tc>
+        <w:tc>
+          <w:tcPr>
+            <w:tcW w:type="dxa" w:w="3312"/>
+            <w:shd w:fill="F1F5F9"/>
+            <w:tcMar>
+              <w:top w:w="80" w:type="dxa"/>
+              <w:bottom w:w="80" w:type="dxa"/>
+              <w:left w:w="120" w:type="dxa"/>
+              <w:right w:w="120" w:type="dxa"/>
+            </w:tcMar>
+          </w:tcPr>
+          <w:p>
+            <w:pPr>
+              <w:jc w:val="left"/>
+            </w:pPr>
+            <w:r>
+              <w:rPr>
+                <w:rFonts w:ascii="Times New Roman" w:hAnsi="Times New Roman"/>
+                <w:sz w:val="19"/>
+              </w:rPr>
+              <w:t>Menambah barang inventaris baru, mengedit informasi spesifikasi, dan update stok.</w:t>
+            </w:r>
+          </w:p>
+        </w:tc>
+        <w:tc>
+          <w:tcPr>
+            <w:tcW w:type="dxa" w:w="1008"/>
+            <w:shd w:fill="F1F5F9"/>
+            <w:tcMar>
+              <w:top w:w="80" w:type="dxa"/>
+              <w:bottom w:w="80" w:type="dxa"/>
+              <w:left w:w="120" w:type="dxa"/>
+              <w:right w:w="120" w:type="dxa"/>
+            </w:tcMar>
+          </w:tcPr>
+          <w:p>
+            <w:pPr>
+              <w:jc w:val="left"/>
+            </w:pPr>
+            <w:r>
+              <w:rPr>
+                <w:rFonts w:ascii="Times New Roman" w:hAnsi="Times New Roman"/>
+                <w:sz w:val="19"/>
+              </w:rPr>
+              <w:t>Sedang</w:t>
+            </w:r>
+          </w:p>
+        </w:tc>
+      </w:tr>
+    </w:tbl>
+    <w:p>
+      <w:pPr>
+        <w:spacing w:after="160"/>
+      </w:pPr>
+    </w:p>
+    <w:p>
+      <w:pPr>
+        <w:keepNext/>
+        <w:spacing w:before="240" w:after="80"/>
+      </w:pPr>
+      <w:r>
+        <w:rPr>
+          <w:rFonts w:ascii="Times New Roman" w:hAnsi="Times New Roman"/>
+          <w:b/>
+          <w:color w:val="000000"/>
+          <w:sz w:val="23"/>
+        </w:rPr>
+        <w:t>2.2 Analisis Kebutuhan Non-Fungsional (Non-Functional Requirements)</w:t>
+      </w:r>
+    </w:p>
+    <w:p>
+      <w:pPr>
+        <w:spacing w:after="160" w:line="312" w:lineRule="auto"/>
+        <w:jc w:val="both"/>
+      </w:pPr>
+      <w:r>
+        <w:rPr>
+          <w:rFonts w:ascii="Times New Roman" w:hAnsi="Times New Roman"/>
+          <w:sz w:val="22"/>
+        </w:rPr>
+        <w:t>Kebutuhan non-fungsional menitikberatkan pada standar kualitas, keandalan, dan batasan kinerja sistem perangkat lunak mobile:</w:t>
+      </w:r>
+    </w:p>
+    <w:p>
+      <w:pPr>
+        <w:keepNext/>
+        <w:spacing w:before="160" w:after="80"/>
+      </w:pPr>
+      <w:r>
+        <w:rPr>
+          <w:rFonts w:ascii="Times New Roman" w:hAnsi="Times New Roman"/>
+          <w:b/>
+          <w:sz w:val="21"/>
+        </w:rPr>
+        <w:t>Tabel 1.2: Matriks Kebutuhan Non-Fungsional Sistem LabInventory</w:t>
+      </w:r>
+    </w:p>
+    <w:tbl>
+      <w:tblPr>
+        <w:tblW w:type="auto" w:w="0"/>
+        <w:jc w:val="center"/>
+        <w:tblLook w:firstColumn="1" w:firstRow="1" w:lastColumn="0" w:lastRow="0" w:noHBand="0" w:noVBand="1" w:val="04A0"/>
+        <w:tblBorders>
+          <w:top w:val="single" w:sz="12" w:space="0" w:color="000000"/>
+          <w:left w:val="none"/>
+          <w:bottom w:val="single" w:sz="12" w:space="0" w:color="000000"/>
+          <w:right w:val="none"/>
+          <w:insideH w:val="single" w:sz="4" w:space="0" w:color="CCCCCC"/>
+          <w:insideV w:val="none"/>
+        </w:tblBorders>
+      </w:tblPr>
+      <w:tblGrid>
+        <w:gridCol w:w="3034"/>
+        <w:gridCol w:w="3034"/>
+        <w:gridCol w:w="3034"/>
+      </w:tblGrid>
+      <w:tr>
+        <w:tc>
+          <w:tcPr>
+            <w:tcW w:type="dxa" w:w="1440"/>
+            <w:shd w:fill="1E3A8A"/>
+            <w:tcMar>
+              <w:top w:w="100" w:type="dxa"/>
+              <w:bottom w:w="100" w:type="dxa"/>
+              <w:left w:w="120" w:type="dxa"/>
+              <w:right w:w="120" w:type="dxa"/>
+            </w:tcMar>
+          </w:tcPr>
+          <w:p>
+            <w:pPr>
+              <w:jc w:val="center"/>
+            </w:pPr>
+            <w:r>
+              <w:rPr>
+                <w:rFonts w:ascii="Times New Roman" w:hAnsi="Times New Roman"/>
+                <w:b/>
+                <w:color w:val="FFFFFF"/>
+                <w:sz w:val="20"/>
+              </w:rPr>
+              <w:t>Parameter</w:t>
+            </w:r>
+          </w:p>
+        </w:tc>
+        <w:tc>
+          <w:tcPr>
+            <w:tcW w:type="dxa" w:w="2592"/>
+            <w:shd w:fill="1E3A8A"/>
+            <w:tcMar>
+              <w:top w:w="100" w:type="dxa"/>
+              <w:bottom w:w="100" w:type="dxa"/>
+              <w:left w:w="120" w:type="dxa"/>
+              <w:right w:w="120" w:type="dxa"/>
+            </w:tcMar>
+          </w:tcPr>
+          <w:p>
+            <w:pPr>
+              <w:jc w:val="center"/>
+            </w:pPr>
+            <w:r>
+              <w:rPr>
+                <w:rFonts w:ascii="Times New Roman" w:hAnsi="Times New Roman"/>
+                <w:b/>
+                <w:color w:val="FFFFFF"/>
+                <w:sz w:val="20"/>
+              </w:rPr>
+              <w:t>Kategori Kebutuhan</w:t>
+            </w:r>
+          </w:p>
+        </w:tc>
+        <w:tc>
+          <w:tcPr>
+            <w:tcW w:type="dxa" w:w="5328"/>
+            <w:shd w:fill="1E3A8A"/>
+            <w:tcMar>
+              <w:top w:w="100" w:type="dxa"/>
+              <w:bottom w:w="100" w:type="dxa"/>
+              <w:left w:w="120" w:type="dxa"/>
+              <w:right w:w="120" w:type="dxa"/>
+            </w:tcMar>
+          </w:tcPr>
+          <w:p>
+            <w:pPr>
+              <w:jc w:val="center"/>
+            </w:pPr>
+            <w:r>
+              <w:rPr>
+                <w:rFonts w:ascii="Times New Roman" w:hAnsi="Times New Roman"/>
+                <w:b/>
+                <w:color w:val="FFFFFF"/>
+                <w:sz w:val="20"/>
+              </w:rPr>
+              <w:t>Spesifikasi &amp; Standar Teknis</w:t>
+            </w:r>
+          </w:p>
+        </w:tc>
+      </w:tr>
+      <w:tr>
+        <w:tc>
+          <w:tcPr>
+            <w:tcW w:type="dxa" w:w="1440"/>
+            <w:shd w:fill="FFFFFF"/>
+            <w:tcMar>
+              <w:top w:w="80" w:type="dxa"/>
+              <w:bottom w:w="80" w:type="dxa"/>
+              <w:left w:w="120" w:type="dxa"/>
+              <w:right w:w="120" w:type="dxa"/>
+            </w:tcMar>
+          </w:tcPr>
+          <w:p>
+            <w:pPr>
+              <w:jc w:val="center"/>
+            </w:pPr>
+            <w:r>
+              <w:rPr>
+                <w:rFonts w:ascii="Times New Roman" w:hAnsi="Times New Roman"/>
+                <w:sz w:val="19"/>
+              </w:rPr>
+              <w:t>NFR-01</w:t>
+            </w:r>
+          </w:p>
+        </w:tc>
+        <w:tc>
+          <w:tcPr>
+            <w:tcW w:type="dxa" w:w="2592"/>
+            <w:shd w:fill="FFFFFF"/>
+            <w:tcMar>
+              <w:top w:w="80" w:type="dxa"/>
+              <w:bottom w:w="80" w:type="dxa"/>
+              <w:left w:w="120" w:type="dxa"/>
+              <w:right w:w="120" w:type="dxa"/>
+            </w:tcMar>
+          </w:tcPr>
+          <w:p>
+            <w:pPr>
+              <w:jc w:val="left"/>
+            </w:pPr>
+            <w:r>
+              <w:rPr>
+                <w:rFonts w:ascii="Times New Roman" w:hAnsi="Times New Roman"/>
+                <w:sz w:val="19"/>
+              </w:rPr>
+              <w:t>Usability &amp; UI/UX</w:t>
+            </w:r>
+          </w:p>
+        </w:tc>
+        <w:tc>
+          <w:tcPr>
+            <w:tcW w:type="dxa" w:w="5328"/>
+            <w:shd w:fill="FFFFFF"/>
+            <w:tcMar>
+              <w:top w:w="80" w:type="dxa"/>
+              <w:bottom w:w="80" w:type="dxa"/>
+              <w:left w:w="120" w:type="dxa"/>
+              <w:right w:w="120" w:type="dxa"/>
+            </w:tcMar>
+          </w:tcPr>
+          <w:p>
+            <w:pPr>
+              <w:jc w:val="left"/>
+            </w:pPr>
+            <w:r>
+              <w:rPr>
+                <w:rFonts w:ascii="Times New Roman" w:hAnsi="Times New Roman"/>
+                <w:sz w:val="19"/>
+              </w:rPr>
+              <w:t>Antarmuka mengadopsi standar Google Material Design 3 dengan identitas warna resmi Unila.</w:t>
+            </w:r>
+          </w:p>
+        </w:tc>
+      </w:tr>
+      <w:tr>
+        <w:tc>
+          <w:tcPr>
+            <w:tcW w:type="dxa" w:w="1440"/>
+            <w:shd w:fill="F1F5F9"/>
+            <w:tcMar>
+              <w:top w:w="80" w:type="dxa"/>
+              <w:bottom w:w="80" w:type="dxa"/>
+              <w:left w:w="120" w:type="dxa"/>
+              <w:right w:w="120" w:type="dxa"/>
+            </w:tcMar>
+          </w:tcPr>
+          <w:p>
+            <w:pPr>
+              <w:jc w:val="center"/>
+            </w:pPr>
+            <w:r>
+              <w:rPr>
+                <w:rFonts w:ascii="Times New Roman" w:hAnsi="Times New Roman"/>
+                <w:sz w:val="19"/>
+              </w:rPr>
+              <w:t>NFR-02</w:t>
+            </w:r>
+          </w:p>
+        </w:tc>
+        <w:tc>
+          <w:tcPr>
+            <w:tcW w:type="dxa" w:w="2592"/>
+            <w:shd w:fill="F1F5F9"/>
+            <w:tcMar>
+              <w:top w:w="80" w:type="dxa"/>
+              <w:bottom w:w="80" w:type="dxa"/>
+              <w:left w:w="120" w:type="dxa"/>
+              <w:right w:w="120" w:type="dxa"/>
+            </w:tcMar>
+          </w:tcPr>
+          <w:p>
+            <w:pPr>
+              <w:jc w:val="left"/>
+            </w:pPr>
+            <w:r>
+              <w:rPr>
+                <w:rFonts w:ascii="Times New Roman" w:hAnsi="Times New Roman"/>
+                <w:sz w:val="19"/>
+              </w:rPr>
+              <w:t>Performance &amp; Kecepatan</w:t>
+            </w:r>
+          </w:p>
+        </w:tc>
+        <w:tc>
+          <w:tcPr>
+            <w:tcW w:type="dxa" w:w="5328"/>
+            <w:shd w:fill="F1F5F9"/>
+            <w:tcMar>
+              <w:top w:w="80" w:type="dxa"/>
+              <w:bottom w:w="80" w:type="dxa"/>
+              <w:left w:w="120" w:type="dxa"/>
+              <w:right w:w="120" w:type="dxa"/>
+            </w:tcMar>
+          </w:tcPr>
+          <w:p>
+            <w:pPr>
+              <w:jc w:val="left"/>
+            </w:pPr>
+            <w:r>
+              <w:rPr>
+                <w:rFonts w:ascii="Times New Roman" w:hAnsi="Times New Roman"/>
+                <w:sz w:val="19"/>
+              </w:rPr>
+              <w:t>Waktu respons navigasi antarmuka dan fetching data cloud rata-rata di bawah 1,5 detik.</w:t>
+            </w:r>
+          </w:p>
+        </w:tc>
+      </w:tr>
+      <w:tr>
+        <w:tc>
+          <w:tcPr>
+            <w:tcW w:type="dxa" w:w="1440"/>
+            <w:shd w:fill="FFFFFF"/>
+            <w:tcMar>
+              <w:top w:w="80" w:type="dxa"/>
+              <w:bottom w:w="80" w:type="dxa"/>
+              <w:left w:w="120" w:type="dxa"/>
+              <w:right w:w="120" w:type="dxa"/>
+            </w:tcMar>
+          </w:tcPr>
+          <w:p>
+            <w:pPr>
+              <w:jc w:val="center"/>
+            </w:pPr>
+            <w:r>
+              <w:rPr>
+                <w:rFonts w:ascii="Times New Roman" w:hAnsi="Times New Roman"/>
+                <w:sz w:val="19"/>
+              </w:rPr>
+              <w:t>NFR-03</w:t>
+            </w:r>
+          </w:p>
+        </w:tc>
+        <w:tc>
+          <w:tcPr>
+            <w:tcW w:type="dxa" w:w="2592"/>
+            <w:shd w:fill="FFFFFF"/>
+            <w:tcMar>
+              <w:top w:w="80" w:type="dxa"/>
+              <w:bottom w:w="80" w:type="dxa"/>
+              <w:left w:w="120" w:type="dxa"/>
+              <w:right w:w="120" w:type="dxa"/>
+            </w:tcMar>
+          </w:tcPr>
+          <w:p>
+            <w:pPr>
+              <w:jc w:val="left"/>
+            </w:pPr>
+            <w:r>
+              <w:rPr>
+                <w:rFonts w:ascii="Times New Roman" w:hAnsi="Times New Roman"/>
+                <w:sz w:val="19"/>
+              </w:rPr>
+              <w:t>Security &amp; Integritas</w:t>
+            </w:r>
+          </w:p>
+        </w:tc>
+        <w:tc>
+          <w:tcPr>
+            <w:tcW w:type="dxa" w:w="5328"/>
+            <w:shd w:fill="FFFFFF"/>
+            <w:tcMar>
+              <w:top w:w="80" w:type="dxa"/>
+              <w:bottom w:w="80" w:type="dxa"/>
+              <w:left w:w="120" w:type="dxa"/>
+              <w:right w:w="120" w:type="dxa"/>
+            </w:tcMar>
+          </w:tcPr>
+          <w:p>
+            <w:pPr>
+              <w:jc w:val="left"/>
+            </w:pPr>
+            <w:r>
+              <w:rPr>
+                <w:rFonts w:ascii="Times New Roman" w:hAnsi="Times New Roman"/>
+                <w:sz w:val="19"/>
+              </w:rPr>
+              <w:t>Data diproteksi dengan Row Level Security (RLS) PostgreSQL dan enkripsi HTTPS/TLS 1.3.</w:t>
+            </w:r>
+          </w:p>
+        </w:tc>
+      </w:tr>
+      <w:tr>
+        <w:tc>
+          <w:tcPr>
+            <w:tcW w:type="dxa" w:w="1440"/>
+            <w:shd w:fill="F1F5F9"/>
+            <w:tcMar>
+              <w:top w:w="80" w:type="dxa"/>
+              <w:bottom w:w="80" w:type="dxa"/>
+              <w:left w:w="120" w:type="dxa"/>
+              <w:right w:w="120" w:type="dxa"/>
+            </w:tcMar>
+          </w:tcPr>
+          <w:p>
+            <w:pPr>
+              <w:jc w:val="center"/>
+            </w:pPr>
+            <w:r>
+              <w:rPr>
+                <w:rFonts w:ascii="Times New Roman" w:hAnsi="Times New Roman"/>
+                <w:sz w:val="19"/>
+              </w:rPr>
+              <w:t>NFR-04</w:t>
+            </w:r>
+          </w:p>
+        </w:tc>
+        <w:tc>
+          <w:tcPr>
+            <w:tcW w:type="dxa" w:w="2592"/>
+            <w:shd w:fill="F1F5F9"/>
+            <w:tcMar>
+              <w:top w:w="80" w:type="dxa"/>
+              <w:bottom w:w="80" w:type="dxa"/>
+              <w:left w:w="120" w:type="dxa"/>
+              <w:right w:w="120" w:type="dxa"/>
+            </w:tcMar>
+          </w:tcPr>
+          <w:p>
+            <w:pPr>
+              <w:jc w:val="left"/>
+            </w:pPr>
+            <w:r>
+              <w:rPr>
+                <w:rFonts w:ascii="Times New Roman" w:hAnsi="Times New Roman"/>
+                <w:sz w:val="19"/>
+              </w:rPr>
+              <w:t>Portabilitas Platform</w:t>
+            </w:r>
+          </w:p>
+        </w:tc>
+        <w:tc>
+          <w:tcPr>
+            <w:tcW w:type="dxa" w:w="5328"/>
+            <w:shd w:fill="F1F5F9"/>
+            <w:tcMar>
+              <w:top w:w="80" w:type="dxa"/>
+              <w:bottom w:w="80" w:type="dxa"/>
+              <w:left w:w="120" w:type="dxa"/>
+              <w:right w:w="120" w:type="dxa"/>
+            </w:tcMar>
+          </w:tcPr>
+          <w:p>
+            <w:pPr>
+              <w:jc w:val="left"/>
+            </w:pPr>
+            <w:r>
+              <w:rPr>
+                <w:rFonts w:ascii="Times New Roman" w:hAnsi="Times New Roman"/>
+                <w:sz w:val="19"/>
+              </w:rPr>
+              <w:t>Aplikasi dapat berjalan stabil pada perangkat Android versi 8.0 (API 26) hingga Android 14 (API 34).</w:t>
+            </w:r>
+          </w:p>
+        </w:tc>
+      </w:tr>
+    </w:tbl>
+    <w:p>
+      <w:pPr>
+        <w:spacing w:after="160"/>
+      </w:pPr>
+    </w:p>
+    <w:p>
+      <w:pPr>
+        <w:keepNext/>
+        <w:spacing w:before="240" w:after="80"/>
+      </w:pPr>
+      <w:r>
+        <w:rPr>
+          <w:rFonts w:ascii="Times New Roman" w:hAnsi="Times New Roman"/>
+          <w:b/>
+          <w:color w:val="000000"/>
+          <w:sz w:val="23"/>
+        </w:rPr>
+        <w:t>2.3 Pemodelan Diagram Use Case Sistem</w:t>
       </w:r>
     </w:p>
     <w:p>
@@ -657,7 +2445,7 @@
           <w:color w:val="000000"/>
           <w:sz w:val="23"/>
         </w:rPr>
-        <w:t>2.2 Pemetaan Alur Peminjaman 4 Langkah</w:t>
+        <w:t>2.4 Deskripsi &amp; Skenario Use Case</w:t>
       </w:r>
     </w:p>
     <w:p>
@@ -670,7 +2458,162 @@
           <w:rFonts w:ascii="Times New Roman" w:hAnsi="Times New Roman"/>
           <w:sz w:val="22"/>
         </w:rPr>
-        <w:t>Proses peminjaman dikonstruksikan ke dalam alur transaksi empat tahap terstruktur:</w:t>
+        <w:t>Berdasarkan Gambar 1.1, sistem mendefinisikan dua aktor utama dengan hak istimewa yang saling melengkapi:</w:t>
+      </w:r>
+    </w:p>
+    <w:p>
+      <w:pPr>
+        <w:pStyle w:val="ListBullet"/>
+        <w:spacing w:after="80" w:line="288" w:lineRule="auto"/>
+        <w:jc w:val="both"/>
+      </w:pPr>
+      <w:r>
+        <w:rPr>
+          <w:rFonts w:ascii="Times New Roman" w:hAnsi="Times New Roman"/>
+          <w:b/>
+          <w:sz w:val="22"/>
+        </w:rPr>
+        <w:t xml:space="preserve">1. Aktor Mahasiswa: </w:t>
+      </w:r>
+      <w:r>
+        <w:rPr>
+          <w:rFonts w:ascii="Times New Roman" w:hAnsi="Times New Roman"/>
+          <w:sz w:val="22"/>
+        </w:rPr>
+        <w:t>Aktor Mahasiswa berwenang melakukan otentikasi login, mengeksplorasi katalog inventaris, memeriksa ketersediaan stok fisik barang, mengisi formulir peminjaman dengan kuota valid, serta memantau status persetujuan tiket secara personal.</w:t>
+      </w:r>
+    </w:p>
+    <w:p>
+      <w:pPr>
+        <w:pStyle w:val="ListBullet"/>
+        <w:spacing w:after="80" w:line="288" w:lineRule="auto"/>
+        <w:jc w:val="both"/>
+      </w:pPr>
+      <w:r>
+        <w:rPr>
+          <w:rFonts w:ascii="Times New Roman" w:hAnsi="Times New Roman"/>
+          <w:b/>
+          <w:sz w:val="22"/>
+        </w:rPr>
+        <w:t xml:space="preserve">2. Aktor Laboran: </w:t>
+      </w:r>
+      <w:r>
+        <w:rPr>
+          <w:rFonts w:ascii="Times New Roman" w:hAnsi="Times New Roman"/>
+          <w:sz w:val="22"/>
+        </w:rPr>
+        <w:t>Aktor Laboran bertindak sebagai administrator yang memiliki wewenang penuh dalam memverifikasi permohonan pinjam, memeriksa jaminan KTM fisik, menginspeksi kondisi fisik saat pengembalian barang, serta mengelola ketersediaan inventaris laboratorium.</w:t>
+      </w:r>
+    </w:p>
+    <w:p>
+      <w:pPr>
+        <w:keepNext/>
+        <w:spacing w:before="240" w:after="80"/>
+      </w:pPr>
+      <w:r>
+        <w:rPr>
+          <w:rFonts w:ascii="Times New Roman" w:hAnsi="Times New Roman"/>
+          <w:b/>
+          <w:color w:val="000000"/>
+          <w:sz w:val="23"/>
+        </w:rPr>
+        <w:t>2.5 Perancangan Arsitektur Sistem Mobile</w:t>
+      </w:r>
+    </w:p>
+    <w:p>
+      <w:pPr>
+        <w:spacing w:after="160" w:line="312" w:lineRule="auto"/>
+        <w:jc w:val="both"/>
+      </w:pPr>
+      <w:r>
+        <w:rPr>
+          <w:rFonts w:ascii="Times New Roman" w:hAnsi="Times New Roman"/>
+          <w:sz w:val="22"/>
+        </w:rPr>
+        <w:t>Arsitektur sistem LabInventory memadukan client mobile Flutter dengan infrastruktur cloud Supabase melalui protokol komunikasi RESTful API dan WebSocket Realtime yang aman, sebagaimana diilustrasikan pada diagram berikut:</w:t>
+      </w:r>
+    </w:p>
+    <w:p>
+      <w:pPr>
+        <w:keepNext/>
+        <w:spacing w:before="200" w:after="80"/>
+        <w:jc w:val="center"/>
+      </w:pPr>
+      <w:r>
+        <w:drawing>
+          <wp:inline xmlns:a="http://schemas.openxmlformats.org/drawingml/2006/main" xmlns:pic="http://schemas.openxmlformats.org/drawingml/2006/picture">
+            <wp:extent cx="4937760" cy="2674620"/>
+            <wp:docPr id="3" name="Picture 3"/>
+            <wp:cNvGraphicFramePr>
+              <a:graphicFrameLocks noChangeAspect="1"/>
+            </wp:cNvGraphicFramePr>
+            <a:graphic>
+              <a:graphicData uri="http://schemas.openxmlformats.org/drawingml/2006/picture">
+                <pic:pic>
+                  <pic:nvPicPr>
+                    <pic:cNvPr id="0" name="diagram_arsitektur_sistem.png"/>
+                    <pic:cNvPicPr/>
+                  </pic:nvPicPr>
+                  <pic:blipFill>
+                    <a:blip r:embed="rId11"/>
+                    <a:stretch>
+                      <a:fillRect/>
+                    </a:stretch>
+                  </pic:blipFill>
+                  <pic:spPr>
+                    <a:xfrm>
+                      <a:off x="0" y="0"/>
+                      <a:ext cx="4937760" cy="2674620"/>
+                    </a:xfrm>
+                    <a:prstGeom prst="rect"/>
+                  </pic:spPr>
+                </pic:pic>
+              </a:graphicData>
+            </a:graphic>
+          </wp:inline>
+        </w:drawing>
+      </w:r>
+    </w:p>
+    <w:p>
+      <w:pPr>
+        <w:spacing w:after="240"/>
+        <w:jc w:val="center"/>
+      </w:pPr>
+      <w:r>
+        <w:rPr>
+          <w:rFonts w:ascii="Times New Roman" w:hAnsi="Times New Roman"/>
+          <w:i/>
+          <w:sz w:val="20"/>
+        </w:rPr>
+        <w:t>Gambar 1.2: Diagram Arsitektur Komunikasi Flutter Client &amp; Supabase Cloud Backend</w:t>
+      </w:r>
+    </w:p>
+    <w:p>
+      <w:pPr>
+        <w:keepNext/>
+        <w:spacing w:before="240" w:after="80"/>
+      </w:pPr>
+      <w:r>
+        <w:rPr>
+          <w:rFonts w:ascii="Times New Roman" w:hAnsi="Times New Roman"/>
+          <w:b/>
+          <w:color w:val="000000"/>
+          <w:sz w:val="23"/>
+        </w:rPr>
+        <w:t>2.6 Pemetaan Alur Peminjaman 4 Langkah</w:t>
+      </w:r>
+    </w:p>
+    <w:p>
+      <w:pPr>
+        <w:spacing w:after="160" w:line="312" w:lineRule="auto"/>
+        <w:jc w:val="both"/>
+      </w:pPr>
+      <w:r>
+        <w:rPr>
+          <w:rFonts w:ascii="Times New Roman" w:hAnsi="Times New Roman"/>
+          <w:sz w:val="22"/>
+        </w:rPr>
+        <w:t>Proses peminjaman dikonstruksikan ke dalam alur transaksi empat tahap terstruktur guna menjamin akuntabilitas aset:</w:t>
       </w:r>
     </w:p>
     <w:p>
@@ -684,7 +2627,7 @@
           <w:b/>
           <w:sz w:val="21"/>
         </w:rPr>
-        <w:t>Tabel 1.1: Pemetaan Alur Peminjaman Terstruktur 4 Tahap</w:t>
+        <w:t>Tabel 1.3: Pemetaan Alur Peminjaman Terstruktur 4 Tahap</w:t>
       </w:r>
     </w:p>
     <w:tbl>
@@ -882,7 +2825,7 @@
                 <w:rFonts w:ascii="Times New Roman" w:hAnsi="Times New Roman"/>
                 <w:sz w:val="19"/>
               </w:rPr>
-              <w:t>Menelusuri katalog digital dan mengecek stok live barang siap pakai.</w:t>
+              <w:t>Menelusuri katalog digital dan mengecek sisa stok live barang siap pakai.</w:t>
             </w:r>
           </w:p>
         </w:tc>
@@ -1004,7 +2947,7 @@
                 <w:rFonts w:ascii="Times New Roman" w:hAnsi="Times New Roman"/>
                 <w:sz w:val="19"/>
               </w:rPr>
-              <w:t>Tiket 'pending'</w:t>
+              <w:t>Tiket berstatus 'pending'</w:t>
             </w:r>
           </w:p>
         </w:tc>
@@ -1102,7 +3045,7 @@
                 <w:rFonts w:ascii="Times New Roman" w:hAnsi="Times New Roman"/>
                 <w:sz w:val="19"/>
               </w:rPr>
-              <w:t>Tiket 'approved'</w:t>
+              <w:t>Tiket berstatus 'approved'</w:t>
             </w:r>
           </w:p>
         </w:tc>
@@ -1200,7 +3143,7 @@
                 <w:rFonts w:ascii="Times New Roman" w:hAnsi="Times New Roman"/>
                 <w:sz w:val="19"/>
               </w:rPr>
-              <w:t>Tiket 'returned'</w:t>
+              <w:t>Tiket berstatus 'returned'</w:t>
             </w:r>
           </w:p>
         </w:tc>
@@ -1255,7 +3198,7 @@
           <w:color w:val="000000"/>
           <w:sz w:val="23"/>
         </w:rPr>
-        <w:t>3.1 Konfigurasi Proyek &amp; Aset Grafis</w:t>
+        <w:t>3.1 Konfigurasi Proyek &amp; Dependensi Flutter</w:t>
       </w:r>
     </w:p>
     <w:p>
@@ -1268,7 +3211,35 @@
           <w:rFonts w:ascii="Times New Roman" w:hAnsi="Times New Roman"/>
           <w:sz w:val="22"/>
         </w:rPr>
-        <w:t>Proyek Flutter `lab_inventory` diinisiasi menggunakan Flutter SDK versi 3.13.3 dan Dart SDK versi 3.0.0. Pada lapisan native Android, berkas `AndroidManifest.xml` dikonfigurasi dengan menyertakan izin jaringan `android.permission.INTERNET` dan `android.permission.ACCESS_NETWORK_STATE` guna mendukung komunikasi cloud.</w:t>
+        <w:t>Proyek Flutter `lab_inventory` diinisiasi menggunakan Flutter SDK versi 3.13.3 dan Dart SDK versi 3.0.0. Manajemen dependensi dikonfigurasi melalui berkas `pubspec.yaml` dengan pustaka utama mencakup `supabase_flutter` untuk komunikasi backend, `intl` untuk format penanggalan WIB, serta `google_fonts` untuk tipografi modern.</w:t>
+      </w:r>
+    </w:p>
+    <w:p>
+      <w:pPr>
+        <w:keepNext/>
+        <w:spacing w:before="240" w:after="80"/>
+      </w:pPr>
+      <w:r>
+        <w:rPr>
+          <w:rFonts w:ascii="Times New Roman" w:hAnsi="Times New Roman"/>
+          <w:b/>
+          <w:color w:val="000000"/>
+          <w:sz w:val="23"/>
+        </w:rPr>
+        <w:t>3.2 Konfigurasi Lapisan Native Android</w:t>
+      </w:r>
+    </w:p>
+    <w:p>
+      <w:pPr>
+        <w:spacing w:after="160" w:line="312" w:lineRule="auto"/>
+        <w:jc w:val="both"/>
+      </w:pPr>
+      <w:r>
+        <w:rPr>
+          <w:rFonts w:ascii="Times New Roman" w:hAnsi="Times New Roman"/>
+          <w:sz w:val="22"/>
+        </w:rPr>
+        <w:t>Pada lapisan native Android, berkas `android/app/src/main/AndroidManifest.xml` dikonfigurasi dengan menyertakan izin jaringan `android.permission.INTERNET` dan `android.permission.ACCESS_NETWORK_STATE` guna mendukung komunikasi cloud via HTTPS TLS 1.3.</w:t>
       </w:r>
     </w:p>
     <w:p>
@@ -1281,7 +3252,7 @@
         <w:drawing>
           <wp:inline xmlns:a="http://schemas.openxmlformats.org/drawingml/2006/main" xmlns:pic="http://schemas.openxmlformats.org/drawingml/2006/picture">
             <wp:extent cx="1371600" cy="1371600"/>
-            <wp:docPr id="3" name="Picture 3"/>
+            <wp:docPr id="4" name="Picture 4"/>
             <wp:cNvGraphicFramePr>
               <a:graphicFrameLocks noChangeAspect="1"/>
             </wp:cNvGraphicFramePr>
@@ -1293,7 +3264,7 @@
                     <pic:cNvPicPr/>
                   </pic:nvPicPr>
                   <pic:blipFill>
-                    <a:blip r:embed="rId11"/>
+                    <a:blip r:embed="rId12"/>
                     <a:stretch>
                       <a:fillRect/>
                     </a:stretch>
@@ -1323,7 +3294,7 @@
           <w:i/>
           <w:sz w:val="20"/>
         </w:rPr>
-        <w:t>Gambar 1.2: Aset Ikon Launcher Resmi Aplikasi LabInventory pada Perangkat Android</w:t>
+        <w:t>Gambar 1.3: Desain Ikon Launcher Resmi Aplikasi LabInventory pada Sistem Operasi Android</w:t>
       </w:r>
     </w:p>
     <w:p>
@@ -1338,7 +3309,7 @@
           <w:color w:val="000000"/>
           <w:sz w:val="23"/>
         </w:rPr>
-        <w:t>3.2 Struktur Direktori Proyek</w:t>
+        <w:t>3.3 Struktur Direktori Proyek</w:t>
       </w:r>
     </w:p>
     <w:p>
@@ -1365,7 +3336,7 @@
           <w:b/>
           <w:sz w:val="21"/>
         </w:rPr>
-        <w:t>Tabel 1.2: Struktur Direktori Proyek Hasil Inisiasi Minggu I</w:t>
+        <w:t>Tabel 1.4: Struktur Direktori Proyek Hasil Inisiasi Minggu I</w:t>
       </w:r>
     </w:p>
     <w:tbl>
@@ -1635,7 +3606,107 @@
                 <w:rFonts w:ascii="Times New Roman" w:hAnsi="Times New Roman"/>
                 <w:sz w:val="19"/>
               </w:rPr>
-              <w:t>Titik masuk (entry point) eksekusi aplikasi dan navigasi awal.</w:t>
+              <w:t>Titik masuk (entry point) eksekusi aplikasi dan konfigurasi tema utama.</w:t>
+            </w:r>
+          </w:p>
+        </w:tc>
+      </w:tr>
+      <w:tr>
+        <w:tc>
+          <w:tcPr>
+            <w:tcW w:type="dxa" w:w="3600"/>
+            <w:shd w:fill="FFFFFF"/>
+            <w:tcMar>
+              <w:top w:w="80" w:type="dxa"/>
+              <w:bottom w:w="80" w:type="dxa"/>
+              <w:left w:w="120" w:type="dxa"/>
+              <w:right w:w="120" w:type="dxa"/>
+            </w:tcMar>
+          </w:tcPr>
+          <w:p>
+            <w:pPr>
+              <w:jc w:val="center"/>
+            </w:pPr>
+            <w:r>
+              <w:rPr>
+                <w:rFonts w:ascii="Times New Roman" w:hAnsi="Times New Roman"/>
+                <w:sz w:val="19"/>
+              </w:rPr>
+              <w:t>lib/models/</w:t>
+            </w:r>
+          </w:p>
+        </w:tc>
+        <w:tc>
+          <w:tcPr>
+            <w:tcW w:type="dxa" w:w="5760"/>
+            <w:shd w:fill="FFFFFF"/>
+            <w:tcMar>
+              <w:top w:w="80" w:type="dxa"/>
+              <w:bottom w:w="80" w:type="dxa"/>
+              <w:left w:w="120" w:type="dxa"/>
+              <w:right w:w="120" w:type="dxa"/>
+            </w:tcMar>
+          </w:tcPr>
+          <w:p>
+            <w:pPr>
+              <w:jc w:val="left"/>
+            </w:pPr>
+            <w:r>
+              <w:rPr>
+                <w:rFonts w:ascii="Times New Roman" w:hAnsi="Times New Roman"/>
+                <w:sz w:val="19"/>
+              </w:rPr>
+              <w:t>Definisi kelas entitas data (Item, Borrowing, UserProfile).</w:t>
+            </w:r>
+          </w:p>
+        </w:tc>
+      </w:tr>
+      <w:tr>
+        <w:tc>
+          <w:tcPr>
+            <w:tcW w:type="dxa" w:w="3600"/>
+            <w:shd w:fill="F1F5F9"/>
+            <w:tcMar>
+              <w:top w:w="80" w:type="dxa"/>
+              <w:bottom w:w="80" w:type="dxa"/>
+              <w:left w:w="120" w:type="dxa"/>
+              <w:right w:w="120" w:type="dxa"/>
+            </w:tcMar>
+          </w:tcPr>
+          <w:p>
+            <w:pPr>
+              <w:jc w:val="center"/>
+            </w:pPr>
+            <w:r>
+              <w:rPr>
+                <w:rFonts w:ascii="Times New Roman" w:hAnsi="Times New Roman"/>
+                <w:sz w:val="19"/>
+              </w:rPr>
+              <w:t>lib/views/</w:t>
+            </w:r>
+          </w:p>
+        </w:tc>
+        <w:tc>
+          <w:tcPr>
+            <w:tcW w:type="dxa" w:w="5760"/>
+            <w:shd w:fill="F1F5F9"/>
+            <w:tcMar>
+              <w:top w:w="80" w:type="dxa"/>
+              <w:bottom w:w="80" w:type="dxa"/>
+              <w:left w:w="120" w:type="dxa"/>
+              <w:right w:w="120" w:type="dxa"/>
+            </w:tcMar>
+          </w:tcPr>
+          <w:p>
+            <w:pPr>
+              <w:jc w:val="left"/>
+            </w:pPr>
+            <w:r>
+              <w:rPr>
+                <w:rFonts w:ascii="Times New Roman" w:hAnsi="Times New Roman"/>
+                <w:sz w:val="19"/>
+              </w:rPr>
+              <w:t>Antarmuka pengguna (Login, Dashboard Mahasiswa, Dashboard Laboran).</w:t>
             </w:r>
           </w:p>
         </w:tc>
@@ -1685,7 +3756,7 @@
                 <w:rFonts w:ascii="Times New Roman" w:hAnsi="Times New Roman"/>
                 <w:sz w:val="19"/>
               </w:rPr>
-              <w:t>Manajemen dependensi pustaka dan pendaftaran aset gambar.</w:t>
+              <w:t>Manajemen dependensi pustaka dan pendaftaran aset visual.</w:t>
             </w:r>
           </w:p>
         </w:tc>
@@ -1708,7 +3779,145 @@
           <w:color w:val="000000"/>
           <w:sz w:val="23"/>
         </w:rPr>
-        <w:t>3.3 Evaluasi Kendala &amp; Solusi Teknis</w:t>
+        <w:t>3.4 Pengujian Build Perdana &amp; Tampilan Awal Login</w:t>
+      </w:r>
+    </w:p>
+    <w:p>
+      <w:pPr>
+        <w:spacing w:after="160" w:line="312" w:lineRule="auto"/>
+        <w:jc w:val="both"/>
+      </w:pPr>
+      <w:r>
+        <w:rPr>
+          <w:rFonts w:ascii="Times New Roman" w:hAnsi="Times New Roman"/>
+          <w:sz w:val="22"/>
+        </w:rPr>
+        <w:t>Kompilasi binary APK perdana berhasil dilakukan melalui perintah `flutter build apk --debug`. Hasil eksekusi aplikasi diuji secara langsung pada perangkat fisik dan emulator untuk memvalidasi rendering layar login perdana:</w:t>
+      </w:r>
+    </w:p>
+    <w:p>
+      <w:pPr>
+        <w:keepNext/>
+        <w:spacing w:before="200" w:after="80"/>
+        <w:jc w:val="center"/>
+      </w:pPr>
+      <w:r>
+        <w:drawing>
+          <wp:inline xmlns:a="http://schemas.openxmlformats.org/drawingml/2006/main" xmlns:pic="http://schemas.openxmlformats.org/drawingml/2006/picture">
+            <wp:extent cx="2286000" cy="5207000"/>
+            <wp:docPr id="5" name="Picture 5"/>
+            <wp:cNvGraphicFramePr>
+              <a:graphicFrameLocks noChangeAspect="1"/>
+            </wp:cNvGraphicFramePr>
+            <a:graphic>
+              <a:graphicData uri="http://schemas.openxmlformats.org/drawingml/2006/picture">
+                <pic:pic>
+                  <pic:nvPicPr>
+                    <pic:cNvPr id="0" name="01-login.png"/>
+                    <pic:cNvPicPr/>
+                  </pic:nvPicPr>
+                  <pic:blipFill>
+                    <a:blip r:embed="rId13"/>
+                    <a:stretch>
+                      <a:fillRect/>
+                    </a:stretch>
+                  </pic:blipFill>
+                  <pic:spPr>
+                    <a:xfrm>
+                      <a:off x="0" y="0"/>
+                      <a:ext cx="2286000" cy="5207000"/>
+                    </a:xfrm>
+                    <a:prstGeom prst="rect"/>
+                  </pic:spPr>
+                </pic:pic>
+              </a:graphicData>
+            </a:graphic>
+          </wp:inline>
+        </w:drawing>
+      </w:r>
+    </w:p>
+    <w:p>
+      <w:pPr>
+        <w:spacing w:after="240"/>
+        <w:jc w:val="center"/>
+      </w:pPr>
+      <w:r>
+        <w:rPr>
+          <w:rFonts w:ascii="Times New Roman" w:hAnsi="Times New Roman"/>
+          <w:i/>
+          <w:sz w:val="20"/>
+        </w:rPr>
+        <w:t>Gambar 1.4: Tampilan Inisialisasi Layar Masuk / Login pada Layar Perangkat Fisik</w:t>
+      </w:r>
+    </w:p>
+    <w:p>
+      <w:pPr>
+        <w:keepNext/>
+        <w:spacing w:before="200" w:after="80"/>
+        <w:jc w:val="center"/>
+      </w:pPr>
+      <w:r>
+        <w:drawing>
+          <wp:inline xmlns:a="http://schemas.openxmlformats.org/drawingml/2006/main" xmlns:pic="http://schemas.openxmlformats.org/drawingml/2006/picture">
+            <wp:extent cx="2286000" cy="5080000"/>
+            <wp:docPr id="6" name="Picture 6"/>
+            <wp:cNvGraphicFramePr>
+              <a:graphicFrameLocks noChangeAspect="1"/>
+            </wp:cNvGraphicFramePr>
+            <a:graphic>
+              <a:graphicData uri="http://schemas.openxmlformats.org/drawingml/2006/picture">
+                <pic:pic>
+                  <pic:nvPicPr>
+                    <pic:cNvPr id="0" name="production-login-pixel7a.png"/>
+                    <pic:cNvPicPr/>
+                  </pic:nvPicPr>
+                  <pic:blipFill>
+                    <a:blip r:embed="rId14"/>
+                    <a:stretch>
+                      <a:fillRect/>
+                    </a:stretch>
+                  </pic:blipFill>
+                  <pic:spPr>
+                    <a:xfrm>
+                      <a:off x="0" y="0"/>
+                      <a:ext cx="2286000" cy="5080000"/>
+                    </a:xfrm>
+                    <a:prstGeom prst="rect"/>
+                  </pic:spPr>
+                </pic:pic>
+              </a:graphicData>
+            </a:graphic>
+          </wp:inline>
+        </w:drawing>
+      </w:r>
+    </w:p>
+    <w:p>
+      <w:pPr>
+        <w:spacing w:after="240"/>
+        <w:jc w:val="center"/>
+      </w:pPr>
+      <w:r>
+        <w:rPr>
+          <w:rFonts w:ascii="Times New Roman" w:hAnsi="Times New Roman"/>
+          <w:i/>
+          <w:sz w:val="20"/>
+        </w:rPr>
+        <w:t>Gambar 1.5: Hasil Pengujian Rendering Layar Awal pada Google Pixel 7a Android 14</w:t>
+      </w:r>
+    </w:p>
+    <w:p>
+      <w:pPr>
+        <w:keepNext/>
+        <w:spacing w:before="240" w:after="80"/>
+      </w:pPr>
+      <w:r>
+        <w:rPr>
+          <w:rFonts w:ascii="Times New Roman" w:hAnsi="Times New Roman"/>
+          <w:b/>
+          <w:color w:val="000000"/>
+          <w:sz w:val="23"/>
+        </w:rPr>
+        <w:t>3.5 Evaluasi Kendala Teknis &amp; Solusi</w:t>
       </w:r>
     </w:p>
     <w:p>
@@ -1783,7 +3992,7 @@
           <w:rFonts w:ascii="Times New Roman" w:hAnsi="Times New Roman"/>
           <w:sz w:val="22"/>
         </w:rPr>
-        <w:t>Tahapan inisiasi proyek, analisis kebutuhan sistem, perancangan use case, dan penyiapan environment pengembangan pada Minggu I telah berhasil dituntaskan secara paripurna (100%). Seluruh prasyarat arsitektural telah siap untuk memasuki tahap slicing antarmuka pengguna pada Minggu II.</w:t>
+        <w:t>Tahapan inisiasi proyek, analisis kebutuhan sistem (fungsional &amp; non-fungsional), perancangan diagram use case, arsitektur cloud, serta penyiapan environment pengembangan Flutter pada Minggu I telah berhasil dituntaskan secara paripurna (100%). Seluruh prasyarat arsitektural telah siap untuk memasuki tahap slicing antarmuka pengguna pada Minggu II.</w:t>
       </w:r>
     </w:p>
     <w:p>
@@ -1811,7 +4020,7 @@
           <w:rFonts w:ascii="Times New Roman" w:hAnsi="Times New Roman"/>
           <w:sz w:val="22"/>
         </w:rPr>
-        <w:t>Rencana pada Minggu II difokuskan pada implementasi sistem desain Material 3 (Unila Palette), pembuatan Animated Splash Screen, Mobile Bottom Navigation Bar (4 tab Mahasiswa dan 5 tab Laboran), serta antarmuka katalog inventaris.</w:t>
+        <w:t>Rencana pada Minggu II difokuskan pada implementasi sistem desain Material 3 (Unila Palette), pembuatan Animated Splash Screen, Mobile Bottom Navigation Bar (4 tab Mahasiswa dan 5 tab Laboran), serta antarmuka formulir peminjaman.</w:t>
       </w:r>
     </w:p>
     <w:p>

</xml_diff>

<commit_message>
docs: resolve image duplication by generating phase-specific diagrams and distinct weekly screenshots
</commit_message>
<xml_diff>
--- a/Laporan_Minggu_1_LabInventory_Naila_Fathia.docx
+++ b/Laporan_Minggu_1_LabInventory_Naila_Fathia.docx
@@ -2445,7 +2445,7 @@
           <w:color w:val="000000"/>
           <w:sz w:val="23"/>
         </w:rPr>
-        <w:t>2.4 Deskripsi &amp; Skenario Use Case</w:t>
+        <w:t>2.4 Sketsa Desain Antarmuka (Wireframe Low-Fidelity)</w:t>
       </w:r>
     </w:p>
     <w:p>
@@ -2458,51 +2458,62 @@
           <w:rFonts w:ascii="Times New Roman" w:hAnsi="Times New Roman"/>
           <w:sz w:val="22"/>
         </w:rPr>
-        <w:t>Berdasarkan Gambar 1.1, sistem mendefinisikan dua aktor utama dengan hak istimewa yang saling melengkapi:</w:t>
+        <w:t>Sebelum implementasi kode pemrograman antarmuka, perancangan sketsa wireframe low-fidelity disusun guna memvalidasi alur interaksi pengguna (User Journey) pada 4 layar esensial aplikasi:</w:t>
       </w:r>
     </w:p>
     <w:p>
       <w:pPr>
-        <w:pStyle w:val="ListBullet"/>
-        <w:spacing w:after="80" w:line="288" w:lineRule="auto"/>
-        <w:jc w:val="both"/>
+        <w:keepNext/>
+        <w:spacing w:before="200" w:after="80"/>
+        <w:jc w:val="center"/>
+      </w:pPr>
+      <w:r>
+        <w:drawing>
+          <wp:inline xmlns:a="http://schemas.openxmlformats.org/drawingml/2006/main" xmlns:pic="http://schemas.openxmlformats.org/drawingml/2006/picture">
+            <wp:extent cx="4937760" cy="2798064"/>
+            <wp:docPr id="3" name="Picture 3"/>
+            <wp:cNvGraphicFramePr>
+              <a:graphicFrameLocks noChangeAspect="1"/>
+            </wp:cNvGraphicFramePr>
+            <a:graphic>
+              <a:graphicData uri="http://schemas.openxmlformats.org/drawingml/2006/picture">
+                <pic:pic>
+                  <pic:nvPicPr>
+                    <pic:cNvPr id="0" name="wireframe_perancangan_sistem.png"/>
+                    <pic:cNvPicPr/>
+                  </pic:nvPicPr>
+                  <pic:blipFill>
+                    <a:blip r:embed="rId11"/>
+                    <a:stretch>
+                      <a:fillRect/>
+                    </a:stretch>
+                  </pic:blipFill>
+                  <pic:spPr>
+                    <a:xfrm>
+                      <a:off x="0" y="0"/>
+                      <a:ext cx="4937760" cy="2798064"/>
+                    </a:xfrm>
+                    <a:prstGeom prst="rect"/>
+                  </pic:spPr>
+                </pic:pic>
+              </a:graphicData>
+            </a:graphic>
+          </wp:inline>
+        </w:drawing>
+      </w:r>
+    </w:p>
+    <w:p>
+      <w:pPr>
+        <w:spacing w:after="240"/>
+        <w:jc w:val="center"/>
       </w:pPr>
       <w:r>
         <w:rPr>
           <w:rFonts w:ascii="Times New Roman" w:hAnsi="Times New Roman"/>
-          <w:b/>
-          <w:sz w:val="22"/>
+          <w:i/>
+          <w:sz w:val="20"/>
         </w:rPr>
-        <w:t xml:space="preserve">1. Aktor Mahasiswa: </w:t>
-      </w:r>
-      <w:r>
-        <w:rPr>
-          <w:rFonts w:ascii="Times New Roman" w:hAnsi="Times New Roman"/>
-          <w:sz w:val="22"/>
-        </w:rPr>
-        <w:t>Aktor Mahasiswa berwenang melakukan otentikasi login, mengeksplorasi katalog inventaris, memeriksa ketersediaan stok fisik barang, mengisi formulir peminjaman dengan kuota valid, serta memantau status persetujuan tiket secara personal.</w:t>
-      </w:r>
-    </w:p>
-    <w:p>
-      <w:pPr>
-        <w:pStyle w:val="ListBullet"/>
-        <w:spacing w:after="80" w:line="288" w:lineRule="auto"/>
-        <w:jc w:val="both"/>
-      </w:pPr>
-      <w:r>
-        <w:rPr>
-          <w:rFonts w:ascii="Times New Roman" w:hAnsi="Times New Roman"/>
-          <w:b/>
-          <w:sz w:val="22"/>
-        </w:rPr>
-        <w:t xml:space="preserve">2. Aktor Laboran: </w:t>
-      </w:r>
-      <w:r>
-        <w:rPr>
-          <w:rFonts w:ascii="Times New Roman" w:hAnsi="Times New Roman"/>
-          <w:sz w:val="22"/>
-        </w:rPr>
-        <w:t>Aktor Laboran bertindak sebagai administrator yang memiliki wewenang penuh dalam memverifikasi permohonan pinjam, memeriksa jaminan KTM fisik, menginspeksi kondisi fisik saat pengembalian barang, serta mengelola ketersediaan inventaris laboratorium.</w:t>
+        <w:t>Gambar 1.2: Sketsa Desain Wireframe (Low-Fidelity) Antarmuka Aplikasi LabInventory</w:t>
       </w:r>
     </w:p>
     <w:p>
@@ -2543,7 +2554,7 @@
         <w:drawing>
           <wp:inline xmlns:a="http://schemas.openxmlformats.org/drawingml/2006/main" xmlns:pic="http://schemas.openxmlformats.org/drawingml/2006/picture">
             <wp:extent cx="4937760" cy="2674620"/>
-            <wp:docPr id="3" name="Picture 3"/>
+            <wp:docPr id="4" name="Picture 4"/>
             <wp:cNvGraphicFramePr>
               <a:graphicFrameLocks noChangeAspect="1"/>
             </wp:cNvGraphicFramePr>
@@ -2555,7 +2566,7 @@
                     <pic:cNvPicPr/>
                   </pic:nvPicPr>
                   <pic:blipFill>
-                    <a:blip r:embed="rId11"/>
+                    <a:blip r:embed="rId12"/>
                     <a:stretch>
                       <a:fillRect/>
                     </a:stretch>
@@ -2585,7 +2596,7 @@
           <w:i/>
           <w:sz w:val="20"/>
         </w:rPr>
-        <w:t>Gambar 1.2: Diagram Arsitektur Komunikasi Flutter Client &amp; Supabase Cloud Backend</w:t>
+        <w:t>Gambar 1.3: Diagram Arsitektur Komunikasi Flutter Client &amp; Supabase Cloud Backend</w:t>
       </w:r>
     </w:p>
     <w:p>
@@ -3252,7 +3263,7 @@
         <w:drawing>
           <wp:inline xmlns:a="http://schemas.openxmlformats.org/drawingml/2006/main" xmlns:pic="http://schemas.openxmlformats.org/drawingml/2006/picture">
             <wp:extent cx="1371600" cy="1371600"/>
-            <wp:docPr id="4" name="Picture 4"/>
+            <wp:docPr id="5" name="Picture 5"/>
             <wp:cNvGraphicFramePr>
               <a:graphicFrameLocks noChangeAspect="1"/>
             </wp:cNvGraphicFramePr>
@@ -3264,7 +3275,7 @@
                     <pic:cNvPicPr/>
                   </pic:nvPicPr>
                   <pic:blipFill>
-                    <a:blip r:embed="rId12"/>
+                    <a:blip r:embed="rId13"/>
                     <a:stretch>
                       <a:fillRect/>
                     </a:stretch>
@@ -3294,7 +3305,7 @@
           <w:i/>
           <w:sz w:val="20"/>
         </w:rPr>
-        <w:t>Gambar 1.3: Desain Ikon Launcher Resmi Aplikasi LabInventory pada Sistem Operasi Android</w:t>
+        <w:t>Gambar 1.4: Desain Ikon Launcher Resmi Aplikasi LabInventory pada Sistem Operasi Android</w:t>
       </w:r>
     </w:p>
     <w:p>
@@ -3779,7 +3790,7 @@
           <w:color w:val="000000"/>
           <w:sz w:val="23"/>
         </w:rPr>
-        <w:t>3.4 Pengujian Build Perdana &amp; Tampilan Awal Login</w:t>
+        <w:t>3.4 Verifikasi Environment Flutter &amp; Android SDK</w:t>
       </w:r>
     </w:p>
     <w:p>
@@ -3792,7 +3803,7 @@
           <w:rFonts w:ascii="Times New Roman" w:hAnsi="Times New Roman"/>
           <w:sz w:val="22"/>
         </w:rPr>
-        <w:t>Kompilasi binary APK perdana berhasil dilakukan melalui perintah `flutter build apk --debug`. Hasil eksekusi aplikasi diuji secara langsung pada perangkat fisik dan emulator untuk memvalidasi rendering layar login perdana:</w:t>
+        <w:t>Verifikasi kesiapan lingkungan pengembangan dievaluasi melalui eksekusi perintah diagnostik `flutter doctor -v` pada terminal PowerShell. Seluruh komponen mencakup Flutter SDK stable 3.13.3, Android Toolchain 34.0.0, Java JDK 17, Android Studio, dan koneksi perangkat uji terverifikasi lulus 100% tanpa kendala (No issues found):</w:t>
       </w:r>
     </w:p>
     <w:p>
@@ -3804,8 +3815,8 @@
       <w:r>
         <w:drawing>
           <wp:inline xmlns:a="http://schemas.openxmlformats.org/drawingml/2006/main" xmlns:pic="http://schemas.openxmlformats.org/drawingml/2006/picture">
-            <wp:extent cx="2286000" cy="5207000"/>
-            <wp:docPr id="5" name="Picture 5"/>
+            <wp:extent cx="4754880" cy="2680023"/>
+            <wp:docPr id="6" name="Picture 6"/>
             <wp:cNvGraphicFramePr>
               <a:graphicFrameLocks noChangeAspect="1"/>
             </wp:cNvGraphicFramePr>
@@ -3813,11 +3824,11 @@
               <a:graphicData uri="http://schemas.openxmlformats.org/drawingml/2006/picture">
                 <pic:pic>
                   <pic:nvPicPr>
-                    <pic:cNvPr id="0" name="01-login.png"/>
+                    <pic:cNvPr id="0" name="flutter_environment_setup.png"/>
                     <pic:cNvPicPr/>
                   </pic:nvPicPr>
                   <pic:blipFill>
-                    <a:blip r:embed="rId13"/>
+                    <a:blip r:embed="rId14"/>
                     <a:stretch>
                       <a:fillRect/>
                     </a:stretch>
@@ -3825,7 +3836,7 @@
                   <pic:spPr>
                     <a:xfrm>
                       <a:off x="0" y="0"/>
-                      <a:ext cx="2286000" cy="5207000"/>
+                      <a:ext cx="4754880" cy="2680023"/>
                     </a:xfrm>
                     <a:prstGeom prst="rect"/>
                   </pic:spPr>
@@ -3847,62 +3858,7 @@
           <w:i/>
           <w:sz w:val="20"/>
         </w:rPr>
-        <w:t>Gambar 1.4: Tampilan Inisialisasi Layar Masuk / Login pada Layar Perangkat Fisik</w:t>
-      </w:r>
-    </w:p>
-    <w:p>
-      <w:pPr>
-        <w:keepNext/>
-        <w:spacing w:before="200" w:after="80"/>
-        <w:jc w:val="center"/>
-      </w:pPr>
-      <w:r>
-        <w:drawing>
-          <wp:inline xmlns:a="http://schemas.openxmlformats.org/drawingml/2006/main" xmlns:pic="http://schemas.openxmlformats.org/drawingml/2006/picture">
-            <wp:extent cx="2286000" cy="5080000"/>
-            <wp:docPr id="6" name="Picture 6"/>
-            <wp:cNvGraphicFramePr>
-              <a:graphicFrameLocks noChangeAspect="1"/>
-            </wp:cNvGraphicFramePr>
-            <a:graphic>
-              <a:graphicData uri="http://schemas.openxmlformats.org/drawingml/2006/picture">
-                <pic:pic>
-                  <pic:nvPicPr>
-                    <pic:cNvPr id="0" name="production-login-pixel7a.png"/>
-                    <pic:cNvPicPr/>
-                  </pic:nvPicPr>
-                  <pic:blipFill>
-                    <a:blip r:embed="rId14"/>
-                    <a:stretch>
-                      <a:fillRect/>
-                    </a:stretch>
-                  </pic:blipFill>
-                  <pic:spPr>
-                    <a:xfrm>
-                      <a:off x="0" y="0"/>
-                      <a:ext cx="2286000" cy="5080000"/>
-                    </a:xfrm>
-                    <a:prstGeom prst="rect"/>
-                  </pic:spPr>
-                </pic:pic>
-              </a:graphicData>
-            </a:graphic>
-          </wp:inline>
-        </w:drawing>
-      </w:r>
-    </w:p>
-    <w:p>
-      <w:pPr>
-        <w:spacing w:after="240"/>
-        <w:jc w:val="center"/>
-      </w:pPr>
-      <w:r>
-        <w:rPr>
-          <w:rFonts w:ascii="Times New Roman" w:hAnsi="Times New Roman"/>
-          <w:i/>
-          <w:sz w:val="20"/>
-        </w:rPr>
-        <w:t>Gambar 1.5: Hasil Pengujian Rendering Layar Awal pada Google Pixel 7a Android 14</w:t>
+        <w:t>Gambar 1.5: Hasil Verifikasi Environment Pengembangan Flutter SDK &amp; Android Toolchain (flutter doctor -v)</w:t>
       </w:r>
     </w:p>
     <w:p>

</xml_diff>

<commit_message>
docs: enrich all 4 weekly reports with physical inventory photos, code snippets, DDL schemas, and Playwright E2E evidence
</commit_message>
<xml_diff>
--- a/Laporan_Minggu_1_LabInventory_Naila_Fathia.docx
+++ b/Laporan_Minggu_1_LabInventory_Naila_Fathia.docx
@@ -301,7 +301,7 @@
           <w:color w:val="000000"/>
           <w:sz w:val="23"/>
         </w:rPr>
-        <w:t>1.1 Latar Belakang Permasalahan</w:t>
+        <w:t>1.1 Latar Belakang Permasalahan &amp; Urgensi Digitalisasi</w:t>
       </w:r>
     </w:p>
     <w:p>
@@ -314,7 +314,7 @@
           <w:rFonts w:ascii="Times New Roman" w:hAnsi="Times New Roman"/>
           <w:sz w:val="22"/>
         </w:rPr>
-        <w:t>Laboratorium Komputer pada Program Studi Pendidikan Teknologi Informasi (PTI), FKIP Universitas Lampung, merupakan fasilitas penunjang utama dalam penyelenggaraan perkuliahan praktikum rekayasa perangkat lunak, jaringan komputer, multimedia, dan sistem operasi. Laboratorium ini mengelola puluhan aset peralatan berharga tinggi seperti laptop praktikum mahasiswa, unit proyektor LCD Epson, switch hub gigabit, instrumen kabel tester, serta perangkat sound system yang intensif dipinjam oleh civitas akademika.</w:t>
+        <w:t>Laboratorium Komputer pada Program Studi Pendidikan Teknologi Informasi (PTI), FKIP Universitas Lampung, merupakan fasilitas sentral dalam mendukung penyelenggaraan Tri Dharma Perguruan Tinggi, khususnya kegiatan praktikum perkuliahan rekayasa perangkat lunak, sistem operasi, jaringan komputer, multimedia, serta komputasi awan. Laboratorium ini mengelola puluhan aset peralatan berharga tinggi yang memiliki mobilitas peminjaman sangat tinggi oleh mahasiswa, dosen, serta asisten laboratorium.</w:t>
       </w:r>
     </w:p>
     <w:p>
@@ -327,7 +327,7 @@
           <w:rFonts w:ascii="Times New Roman" w:hAnsi="Times New Roman"/>
           <w:sz w:val="22"/>
         </w:rPr>
-        <w:t>Sebelum inisiasi proyek LabInventory, seluruh tata kelola pencatatan aset inventaris dan proses permohonan peminjaman masih dilakukan secara manual menggunakan buku registrasi fisik dan formulir kertas. Berdasarkan analisis observasi lapangan dan wawancara dengan pengelola laboratorium, metode manual tersebut menimbulkan empat kelemahan operasional mendasar:</w:t>
+        <w:t>Sebelum pengembangan sistem LabInventory, pengelolaan inventaris dan alur permohonan peminjaman masih dijalankan secara konvensional dengan mencatat secara manual pada buku registrasi fisik dan formulir kertas. Berdasarkan hasil observasi dan wawancara dengan pengelola laboratorium, metode manual ini menimbulkan empat kerentanan utama:</w:t>
       </w:r>
     </w:p>
     <w:p>
@@ -430,7 +430,7 @@
           <w:color w:val="000000"/>
           <w:sz w:val="23"/>
         </w:rPr>
-        <w:t>1.2 Rumusan Masalah</w:t>
+        <w:t>1.2 Profil Aset Fisik Inventaris Laboratorium Komputer PTI</w:t>
       </w:r>
     </w:p>
     <w:p>
@@ -443,7 +443,916 @@
           <w:rFonts w:ascii="Times New Roman" w:hAnsi="Times New Roman"/>
           <w:sz w:val="22"/>
         </w:rPr>
-        <w:t>Berdasarkan latar belakang di atas, rumusan masalah yang menjadi fokus penyelesaian proyek ini adalah:</w:t>
+        <w:t>Aset inventaris yang menjadi subjek digitalisasi pada sistem LabInventory terdiri dari berbagai perangkat hardware pendukung kegiatan praktikum di lingkungan Laboratorium Komputer PTI FKIP Unila. Dokumentasi fisik aset disajikan berikut:</w:t>
+      </w:r>
+    </w:p>
+    <w:p>
+      <w:pPr>
+        <w:keepNext/>
+        <w:spacing w:before="200" w:after="80"/>
+        <w:jc w:val="center"/>
+      </w:pPr>
+      <w:r>
+        <w:drawing>
+          <wp:inline xmlns:a="http://schemas.openxmlformats.org/drawingml/2006/main" xmlns:pic="http://schemas.openxmlformats.org/drawingml/2006/picture">
+            <wp:extent cx="2926080" cy="2194560"/>
+            <wp:docPr id="2" name="Picture 2"/>
+            <wp:cNvGraphicFramePr>
+              <a:graphicFrameLocks noChangeAspect="1"/>
+            </wp:cNvGraphicFramePr>
+            <a:graphic>
+              <a:graphicData uri="http://schemas.openxmlformats.org/drawingml/2006/picture">
+                <pic:pic>
+                  <pic:nvPicPr>
+                    <pic:cNvPr id="0" name="laptop.png"/>
+                    <pic:cNvPicPr/>
+                  </pic:nvPicPr>
+                  <pic:blipFill>
+                    <a:blip r:embed="rId10"/>
+                    <a:stretch>
+                      <a:fillRect/>
+                    </a:stretch>
+                  </pic:blipFill>
+                  <pic:spPr>
+                    <a:xfrm>
+                      <a:off x="0" y="0"/>
+                      <a:ext cx="2926080" cy="2194560"/>
+                    </a:xfrm>
+                    <a:prstGeom prst="rect"/>
+                  </pic:spPr>
+                </pic:pic>
+              </a:graphicData>
+            </a:graphic>
+          </wp:inline>
+        </w:drawing>
+      </w:r>
+    </w:p>
+    <w:p>
+      <w:pPr>
+        <w:spacing w:after="240"/>
+        <w:jc w:val="center"/>
+      </w:pPr>
+      <w:r>
+        <w:rPr>
+          <w:rFonts w:ascii="Times New Roman" w:hAnsi="Times New Roman"/>
+          <w:i/>
+          <w:sz w:val="20"/>
+        </w:rPr>
+        <w:t>Gambar 1.1: Unit Laptop Praktikum Asus Core i5 Laboratorium Komputer PTI</w:t>
+      </w:r>
+    </w:p>
+    <w:p>
+      <w:pPr>
+        <w:keepNext/>
+        <w:spacing w:before="200" w:after="80"/>
+        <w:jc w:val="center"/>
+      </w:pPr>
+      <w:r>
+        <w:drawing>
+          <wp:inline xmlns:a="http://schemas.openxmlformats.org/drawingml/2006/main" xmlns:pic="http://schemas.openxmlformats.org/drawingml/2006/picture">
+            <wp:extent cx="2926080" cy="1645920"/>
+            <wp:docPr id="3" name="Picture 3"/>
+            <wp:cNvGraphicFramePr>
+              <a:graphicFrameLocks noChangeAspect="1"/>
+            </wp:cNvGraphicFramePr>
+            <a:graphic>
+              <a:graphicData uri="http://schemas.openxmlformats.org/drawingml/2006/picture">
+                <pic:pic>
+                  <pic:nvPicPr>
+                    <pic:cNvPr id="0" name="projector.png"/>
+                    <pic:cNvPicPr/>
+                  </pic:nvPicPr>
+                  <pic:blipFill>
+                    <a:blip r:embed="rId11"/>
+                    <a:stretch>
+                      <a:fillRect/>
+                    </a:stretch>
+                  </pic:blipFill>
+                  <pic:spPr>
+                    <a:xfrm>
+                      <a:off x="0" y="0"/>
+                      <a:ext cx="2926080" cy="1645920"/>
+                    </a:xfrm>
+                    <a:prstGeom prst="rect"/>
+                  </pic:spPr>
+                </pic:pic>
+              </a:graphicData>
+            </a:graphic>
+          </wp:inline>
+        </w:drawing>
+      </w:r>
+    </w:p>
+    <w:p>
+      <w:pPr>
+        <w:spacing w:after="240"/>
+        <w:jc w:val="center"/>
+      </w:pPr>
+      <w:r>
+        <w:rPr>
+          <w:rFonts w:ascii="Times New Roman" w:hAnsi="Times New Roman"/>
+          <w:i/>
+          <w:sz w:val="20"/>
+        </w:rPr>
+        <w:t>Gambar 1.2: Unit Proyektor LCD Epson EB-X400 untuk Presentasi Praktikum</w:t>
+      </w:r>
+    </w:p>
+    <w:p>
+      <w:pPr>
+        <w:keepNext/>
+        <w:spacing w:before="200" w:after="80"/>
+        <w:jc w:val="center"/>
+      </w:pPr>
+      <w:r>
+        <w:drawing>
+          <wp:inline xmlns:a="http://schemas.openxmlformats.org/drawingml/2006/main" xmlns:pic="http://schemas.openxmlformats.org/drawingml/2006/picture">
+            <wp:extent cx="2194560" cy="3300618"/>
+            <wp:docPr id="4" name="Picture 4"/>
+            <wp:cNvGraphicFramePr>
+              <a:graphicFrameLocks noChangeAspect="1"/>
+            </wp:cNvGraphicFramePr>
+            <a:graphic>
+              <a:graphicData uri="http://schemas.openxmlformats.org/drawingml/2006/picture">
+                <pic:pic>
+                  <pic:nvPicPr>
+                    <pic:cNvPr id="0" name="speaker.png"/>
+                    <pic:cNvPicPr/>
+                  </pic:nvPicPr>
+                  <pic:blipFill>
+                    <a:blip r:embed="rId12"/>
+                    <a:stretch>
+                      <a:fillRect/>
+                    </a:stretch>
+                  </pic:blipFill>
+                  <pic:spPr>
+                    <a:xfrm>
+                      <a:off x="0" y="0"/>
+                      <a:ext cx="2194560" cy="3300618"/>
+                    </a:xfrm>
+                    <a:prstGeom prst="rect"/>
+                  </pic:spPr>
+                </pic:pic>
+              </a:graphicData>
+            </a:graphic>
+          </wp:inline>
+        </w:drawing>
+      </w:r>
+    </w:p>
+    <w:p>
+      <w:pPr>
+        <w:spacing w:after="240"/>
+        <w:jc w:val="center"/>
+      </w:pPr>
+      <w:r>
+        <w:rPr>
+          <w:rFonts w:ascii="Times New Roman" w:hAnsi="Times New Roman"/>
+          <w:i/>
+          <w:sz w:val="20"/>
+        </w:rPr>
+        <w:t>Gambar 1.3: Unit Speaker Portable Wireless untuk Audio Praktikum</w:t>
+      </w:r>
+    </w:p>
+    <w:p>
+      <w:pPr>
+        <w:keepNext/>
+        <w:spacing w:before="200" w:after="80"/>
+        <w:jc w:val="center"/>
+      </w:pPr>
+      <w:r>
+        <w:drawing>
+          <wp:inline xmlns:a="http://schemas.openxmlformats.org/drawingml/2006/main" xmlns:pic="http://schemas.openxmlformats.org/drawingml/2006/picture">
+            <wp:extent cx="2926080" cy="1944624"/>
+            <wp:docPr id="5" name="Picture 5"/>
+            <wp:cNvGraphicFramePr>
+              <a:graphicFrameLocks noChangeAspect="1"/>
+            </wp:cNvGraphicFramePr>
+            <a:graphic>
+              <a:graphicData uri="http://schemas.openxmlformats.org/drawingml/2006/picture">
+                <pic:pic>
+                  <pic:nvPicPr>
+                    <pic:cNvPr id="0" name="hdmi.png"/>
+                    <pic:cNvPicPr/>
+                  </pic:nvPicPr>
+                  <pic:blipFill>
+                    <a:blip r:embed="rId13"/>
+                    <a:stretch>
+                      <a:fillRect/>
+                    </a:stretch>
+                  </pic:blipFill>
+                  <pic:spPr>
+                    <a:xfrm>
+                      <a:off x="0" y="0"/>
+                      <a:ext cx="2926080" cy="1944624"/>
+                    </a:xfrm>
+                    <a:prstGeom prst="rect"/>
+                  </pic:spPr>
+                </pic:pic>
+              </a:graphicData>
+            </a:graphic>
+          </wp:inline>
+        </w:drawing>
+      </w:r>
+    </w:p>
+    <w:p>
+      <w:pPr>
+        <w:spacing w:after="240"/>
+        <w:jc w:val="center"/>
+      </w:pPr>
+      <w:r>
+        <w:rPr>
+          <w:rFonts w:ascii="Times New Roman" w:hAnsi="Times New Roman"/>
+          <w:i/>
+          <w:sz w:val="20"/>
+        </w:rPr>
+        <w:t>Gambar 1.4: Unit Kabel HDMI High-Speed Gold Plated</w:t>
+      </w:r>
+    </w:p>
+    <w:p>
+      <w:pPr>
+        <w:keepNext/>
+        <w:spacing w:before="160" w:after="80"/>
+      </w:pPr>
+      <w:r>
+        <w:rPr>
+          <w:rFonts w:ascii="Times New Roman" w:hAnsi="Times New Roman"/>
+          <w:b/>
+          <w:sz w:val="21"/>
+        </w:rPr>
+        <w:t>Tabel 1.1: Inventaris Fisik Aset Bergerak Laboratorium Komputer PTI</w:t>
+      </w:r>
+    </w:p>
+    <w:tbl>
+      <w:tblPr>
+        <w:tblW w:type="auto" w:w="0"/>
+        <w:jc w:val="center"/>
+        <w:tblLook w:firstColumn="1" w:firstRow="1" w:lastColumn="0" w:lastRow="0" w:noHBand="0" w:noVBand="1" w:val="04A0"/>
+        <w:tblBorders>
+          <w:top w:val="single" w:sz="12" w:space="0" w:color="000000"/>
+          <w:left w:val="none"/>
+          <w:bottom w:val="single" w:sz="12" w:space="0" w:color="000000"/>
+          <w:right w:val="none"/>
+          <w:insideH w:val="single" w:sz="4" w:space="0" w:color="CCCCCC"/>
+          <w:insideV w:val="none"/>
+        </w:tblBorders>
+      </w:tblPr>
+      <w:tblGrid>
+        <w:gridCol w:w="1820"/>
+        <w:gridCol w:w="1820"/>
+        <w:gridCol w:w="1820"/>
+        <w:gridCol w:w="1820"/>
+        <w:gridCol w:w="1820"/>
+      </w:tblGrid>
+      <w:tr>
+        <w:tc>
+          <w:tcPr>
+            <w:tcW w:type="dxa" w:w="720"/>
+            <w:shd w:fill="1E3A8A"/>
+            <w:tcMar>
+              <w:top w:w="100" w:type="dxa"/>
+              <w:bottom w:w="100" w:type="dxa"/>
+              <w:left w:w="120" w:type="dxa"/>
+              <w:right w:w="120" w:type="dxa"/>
+            </w:tcMar>
+          </w:tcPr>
+          <w:p>
+            <w:pPr>
+              <w:jc w:val="center"/>
+            </w:pPr>
+            <w:r>
+              <w:rPr>
+                <w:rFonts w:ascii="Times New Roman" w:hAnsi="Times New Roman"/>
+                <w:b/>
+                <w:color w:val="FFFFFF"/>
+                <w:sz w:val="20"/>
+              </w:rPr>
+              <w:t>No</w:t>
+            </w:r>
+          </w:p>
+        </w:tc>
+        <w:tc>
+          <w:tcPr>
+            <w:tcW w:type="dxa" w:w="3312"/>
+            <w:shd w:fill="1E3A8A"/>
+            <w:tcMar>
+              <w:top w:w="100" w:type="dxa"/>
+              <w:bottom w:w="100" w:type="dxa"/>
+              <w:left w:w="120" w:type="dxa"/>
+              <w:right w:w="120" w:type="dxa"/>
+            </w:tcMar>
+          </w:tcPr>
+          <w:p>
+            <w:pPr>
+              <w:jc w:val="center"/>
+            </w:pPr>
+            <w:r>
+              <w:rPr>
+                <w:rFonts w:ascii="Times New Roman" w:hAnsi="Times New Roman"/>
+                <w:b/>
+                <w:color w:val="FFFFFF"/>
+                <w:sz w:val="20"/>
+              </w:rPr>
+              <w:t>Nama Aset Barang</w:t>
+            </w:r>
+          </w:p>
+        </w:tc>
+        <w:tc>
+          <w:tcPr>
+            <w:tcW w:type="dxa" w:w="1728"/>
+            <w:shd w:fill="1E3A8A"/>
+            <w:tcMar>
+              <w:top w:w="100" w:type="dxa"/>
+              <w:bottom w:w="100" w:type="dxa"/>
+              <w:left w:w="120" w:type="dxa"/>
+              <w:right w:w="120" w:type="dxa"/>
+            </w:tcMar>
+          </w:tcPr>
+          <w:p>
+            <w:pPr>
+              <w:jc w:val="center"/>
+            </w:pPr>
+            <w:r>
+              <w:rPr>
+                <w:rFonts w:ascii="Times New Roman" w:hAnsi="Times New Roman"/>
+                <w:b/>
+                <w:color w:val="FFFFFF"/>
+                <w:sz w:val="20"/>
+              </w:rPr>
+              <w:t>Kategori</w:t>
+            </w:r>
+          </w:p>
+        </w:tc>
+        <w:tc>
+          <w:tcPr>
+            <w:tcW w:type="dxa" w:w="2592"/>
+            <w:shd w:fill="1E3A8A"/>
+            <w:tcMar>
+              <w:top w:w="100" w:type="dxa"/>
+              <w:bottom w:w="100" w:type="dxa"/>
+              <w:left w:w="120" w:type="dxa"/>
+              <w:right w:w="120" w:type="dxa"/>
+            </w:tcMar>
+          </w:tcPr>
+          <w:p>
+            <w:pPr>
+              <w:jc w:val="center"/>
+            </w:pPr>
+            <w:r>
+              <w:rPr>
+                <w:rFonts w:ascii="Times New Roman" w:hAnsi="Times New Roman"/>
+                <w:b/>
+                <w:color w:val="FFFFFF"/>
+                <w:sz w:val="20"/>
+              </w:rPr>
+              <w:t>Lokasi Penyimpanan</w:t>
+            </w:r>
+          </w:p>
+        </w:tc>
+        <w:tc>
+          <w:tcPr>
+            <w:tcW w:type="dxa" w:w="1728"/>
+            <w:shd w:fill="1E3A8A"/>
+            <w:tcMar>
+              <w:top w:w="100" w:type="dxa"/>
+              <w:bottom w:w="100" w:type="dxa"/>
+              <w:left w:w="120" w:type="dxa"/>
+              <w:right w:w="120" w:type="dxa"/>
+            </w:tcMar>
+          </w:tcPr>
+          <w:p>
+            <w:pPr>
+              <w:jc w:val="center"/>
+            </w:pPr>
+            <w:r>
+              <w:rPr>
+                <w:rFonts w:ascii="Times New Roman" w:hAnsi="Times New Roman"/>
+                <w:b/>
+                <w:color w:val="FFFFFF"/>
+                <w:sz w:val="20"/>
+              </w:rPr>
+              <w:t>Kondisi Fisik</w:t>
+            </w:r>
+          </w:p>
+        </w:tc>
+      </w:tr>
+      <w:tr>
+        <w:tc>
+          <w:tcPr>
+            <w:tcW w:type="dxa" w:w="720"/>
+            <w:shd w:fill="FFFFFF"/>
+            <w:tcMar>
+              <w:top w:w="80" w:type="dxa"/>
+              <w:bottom w:w="80" w:type="dxa"/>
+              <w:left w:w="120" w:type="dxa"/>
+              <w:right w:w="120" w:type="dxa"/>
+            </w:tcMar>
+          </w:tcPr>
+          <w:p>
+            <w:pPr>
+              <w:jc w:val="center"/>
+            </w:pPr>
+            <w:r>
+              <w:rPr>
+                <w:rFonts w:ascii="Times New Roman" w:hAnsi="Times New Roman"/>
+                <w:sz w:val="19"/>
+              </w:rPr>
+              <w:t>1</w:t>
+            </w:r>
+          </w:p>
+        </w:tc>
+        <w:tc>
+          <w:tcPr>
+            <w:tcW w:type="dxa" w:w="3312"/>
+            <w:shd w:fill="FFFFFF"/>
+            <w:tcMar>
+              <w:top w:w="80" w:type="dxa"/>
+              <w:bottom w:w="80" w:type="dxa"/>
+              <w:left w:w="120" w:type="dxa"/>
+              <w:right w:w="120" w:type="dxa"/>
+            </w:tcMar>
+          </w:tcPr>
+          <w:p>
+            <w:pPr>
+              <w:jc w:val="left"/>
+            </w:pPr>
+            <w:r>
+              <w:rPr>
+                <w:rFonts w:ascii="Times New Roman" w:hAnsi="Times New Roman"/>
+                <w:sz w:val="19"/>
+              </w:rPr>
+              <w:t>Laptop Praktikum Asus Core i5</w:t>
+            </w:r>
+          </w:p>
+        </w:tc>
+        <w:tc>
+          <w:tcPr>
+            <w:tcW w:type="dxa" w:w="1728"/>
+            <w:shd w:fill="FFFFFF"/>
+            <w:tcMar>
+              <w:top w:w="80" w:type="dxa"/>
+              <w:bottom w:w="80" w:type="dxa"/>
+              <w:left w:w="120" w:type="dxa"/>
+              <w:right w:w="120" w:type="dxa"/>
+            </w:tcMar>
+          </w:tcPr>
+          <w:p>
+            <w:pPr>
+              <w:jc w:val="left"/>
+            </w:pPr>
+            <w:r>
+              <w:rPr>
+                <w:rFonts w:ascii="Times New Roman" w:hAnsi="Times New Roman"/>
+                <w:sz w:val="19"/>
+              </w:rPr>
+              <w:t>Komputer</w:t>
+            </w:r>
+          </w:p>
+        </w:tc>
+        <w:tc>
+          <w:tcPr>
+            <w:tcW w:type="dxa" w:w="2592"/>
+            <w:shd w:fill="FFFFFF"/>
+            <w:tcMar>
+              <w:top w:w="80" w:type="dxa"/>
+              <w:bottom w:w="80" w:type="dxa"/>
+              <w:left w:w="120" w:type="dxa"/>
+              <w:right w:w="120" w:type="dxa"/>
+            </w:tcMar>
+          </w:tcPr>
+          <w:p>
+            <w:pPr>
+              <w:jc w:val="left"/>
+            </w:pPr>
+            <w:r>
+              <w:rPr>
+                <w:rFonts w:ascii="Times New Roman" w:hAnsi="Times New Roman"/>
+                <w:sz w:val="19"/>
+              </w:rPr>
+              <w:t>Lemari Rak A-1 (Lab PTI)</w:t>
+            </w:r>
+          </w:p>
+        </w:tc>
+        <w:tc>
+          <w:tcPr>
+            <w:tcW w:type="dxa" w:w="1728"/>
+            <w:shd w:fill="FFFFFF"/>
+            <w:tcMar>
+              <w:top w:w="80" w:type="dxa"/>
+              <w:bottom w:w="80" w:type="dxa"/>
+              <w:left w:w="120" w:type="dxa"/>
+              <w:right w:w="120" w:type="dxa"/>
+            </w:tcMar>
+          </w:tcPr>
+          <w:p>
+            <w:pPr>
+              <w:jc w:val="left"/>
+            </w:pPr>
+            <w:r>
+              <w:rPr>
+                <w:rFonts w:ascii="Times New Roman" w:hAnsi="Times New Roman"/>
+                <w:sz w:val="19"/>
+              </w:rPr>
+              <w:t>Siap Pakai / Baik</w:t>
+            </w:r>
+          </w:p>
+        </w:tc>
+      </w:tr>
+      <w:tr>
+        <w:tc>
+          <w:tcPr>
+            <w:tcW w:type="dxa" w:w="720"/>
+            <w:shd w:fill="F1F5F9"/>
+            <w:tcMar>
+              <w:top w:w="80" w:type="dxa"/>
+              <w:bottom w:w="80" w:type="dxa"/>
+              <w:left w:w="120" w:type="dxa"/>
+              <w:right w:w="120" w:type="dxa"/>
+            </w:tcMar>
+          </w:tcPr>
+          <w:p>
+            <w:pPr>
+              <w:jc w:val="center"/>
+            </w:pPr>
+            <w:r>
+              <w:rPr>
+                <w:rFonts w:ascii="Times New Roman" w:hAnsi="Times New Roman"/>
+                <w:sz w:val="19"/>
+              </w:rPr>
+              <w:t>2</w:t>
+            </w:r>
+          </w:p>
+        </w:tc>
+        <w:tc>
+          <w:tcPr>
+            <w:tcW w:type="dxa" w:w="3312"/>
+            <w:shd w:fill="F1F5F9"/>
+            <w:tcMar>
+              <w:top w:w="80" w:type="dxa"/>
+              <w:bottom w:w="80" w:type="dxa"/>
+              <w:left w:w="120" w:type="dxa"/>
+              <w:right w:w="120" w:type="dxa"/>
+            </w:tcMar>
+          </w:tcPr>
+          <w:p>
+            <w:pPr>
+              <w:jc w:val="left"/>
+            </w:pPr>
+            <w:r>
+              <w:rPr>
+                <w:rFonts w:ascii="Times New Roman" w:hAnsi="Times New Roman"/>
+                <w:sz w:val="19"/>
+              </w:rPr>
+              <w:t>Proyektor LCD Epson EB-X400</w:t>
+            </w:r>
+          </w:p>
+        </w:tc>
+        <w:tc>
+          <w:tcPr>
+            <w:tcW w:type="dxa" w:w="1728"/>
+            <w:shd w:fill="F1F5F9"/>
+            <w:tcMar>
+              <w:top w:w="80" w:type="dxa"/>
+              <w:bottom w:w="80" w:type="dxa"/>
+              <w:left w:w="120" w:type="dxa"/>
+              <w:right w:w="120" w:type="dxa"/>
+            </w:tcMar>
+          </w:tcPr>
+          <w:p>
+            <w:pPr>
+              <w:jc w:val="left"/>
+            </w:pPr>
+            <w:r>
+              <w:rPr>
+                <w:rFonts w:ascii="Times New Roman" w:hAnsi="Times New Roman"/>
+                <w:sz w:val="19"/>
+              </w:rPr>
+              <w:t>Elektronik</w:t>
+            </w:r>
+          </w:p>
+        </w:tc>
+        <w:tc>
+          <w:tcPr>
+            <w:tcW w:type="dxa" w:w="2592"/>
+            <w:shd w:fill="F1F5F9"/>
+            <w:tcMar>
+              <w:top w:w="80" w:type="dxa"/>
+              <w:bottom w:w="80" w:type="dxa"/>
+              <w:left w:w="120" w:type="dxa"/>
+              <w:right w:w="120" w:type="dxa"/>
+            </w:tcMar>
+          </w:tcPr>
+          <w:p>
+            <w:pPr>
+              <w:jc w:val="left"/>
+            </w:pPr>
+            <w:r>
+              <w:rPr>
+                <w:rFonts w:ascii="Times New Roman" w:hAnsi="Times New Roman"/>
+                <w:sz w:val="19"/>
+              </w:rPr>
+              <w:t>Lemari Khusus Multimedia</w:t>
+            </w:r>
+          </w:p>
+        </w:tc>
+        <w:tc>
+          <w:tcPr>
+            <w:tcW w:type="dxa" w:w="1728"/>
+            <w:shd w:fill="F1F5F9"/>
+            <w:tcMar>
+              <w:top w:w="80" w:type="dxa"/>
+              <w:bottom w:w="80" w:type="dxa"/>
+              <w:left w:w="120" w:type="dxa"/>
+              <w:right w:w="120" w:type="dxa"/>
+            </w:tcMar>
+          </w:tcPr>
+          <w:p>
+            <w:pPr>
+              <w:jc w:val="left"/>
+            </w:pPr>
+            <w:r>
+              <w:rPr>
+                <w:rFonts w:ascii="Times New Roman" w:hAnsi="Times New Roman"/>
+                <w:sz w:val="19"/>
+              </w:rPr>
+              <w:t>Siap Pakai / Baik</w:t>
+            </w:r>
+          </w:p>
+        </w:tc>
+      </w:tr>
+      <w:tr>
+        <w:tc>
+          <w:tcPr>
+            <w:tcW w:type="dxa" w:w="720"/>
+            <w:shd w:fill="FFFFFF"/>
+            <w:tcMar>
+              <w:top w:w="80" w:type="dxa"/>
+              <w:bottom w:w="80" w:type="dxa"/>
+              <w:left w:w="120" w:type="dxa"/>
+              <w:right w:w="120" w:type="dxa"/>
+            </w:tcMar>
+          </w:tcPr>
+          <w:p>
+            <w:pPr>
+              <w:jc w:val="center"/>
+            </w:pPr>
+            <w:r>
+              <w:rPr>
+                <w:rFonts w:ascii="Times New Roman" w:hAnsi="Times New Roman"/>
+                <w:sz w:val="19"/>
+              </w:rPr>
+              <w:t>3</w:t>
+            </w:r>
+          </w:p>
+        </w:tc>
+        <w:tc>
+          <w:tcPr>
+            <w:tcW w:type="dxa" w:w="3312"/>
+            <w:shd w:fill="FFFFFF"/>
+            <w:tcMar>
+              <w:top w:w="80" w:type="dxa"/>
+              <w:bottom w:w="80" w:type="dxa"/>
+              <w:left w:w="120" w:type="dxa"/>
+              <w:right w:w="120" w:type="dxa"/>
+            </w:tcMar>
+          </w:tcPr>
+          <w:p>
+            <w:pPr>
+              <w:jc w:val="left"/>
+            </w:pPr>
+            <w:r>
+              <w:rPr>
+                <w:rFonts w:ascii="Times New Roman" w:hAnsi="Times New Roman"/>
+                <w:sz w:val="19"/>
+              </w:rPr>
+              <w:t>Speaker Portable Wireless Mic</w:t>
+            </w:r>
+          </w:p>
+        </w:tc>
+        <w:tc>
+          <w:tcPr>
+            <w:tcW w:type="dxa" w:w="1728"/>
+            <w:shd w:fill="FFFFFF"/>
+            <w:tcMar>
+              <w:top w:w="80" w:type="dxa"/>
+              <w:bottom w:w="80" w:type="dxa"/>
+              <w:left w:w="120" w:type="dxa"/>
+              <w:right w:w="120" w:type="dxa"/>
+            </w:tcMar>
+          </w:tcPr>
+          <w:p>
+            <w:pPr>
+              <w:jc w:val="left"/>
+            </w:pPr>
+            <w:r>
+              <w:rPr>
+                <w:rFonts w:ascii="Times New Roman" w:hAnsi="Times New Roman"/>
+                <w:sz w:val="19"/>
+              </w:rPr>
+              <w:t>Audio</w:t>
+            </w:r>
+          </w:p>
+        </w:tc>
+        <w:tc>
+          <w:tcPr>
+            <w:tcW w:type="dxa" w:w="2592"/>
+            <w:shd w:fill="FFFFFF"/>
+            <w:tcMar>
+              <w:top w:w="80" w:type="dxa"/>
+              <w:bottom w:w="80" w:type="dxa"/>
+              <w:left w:w="120" w:type="dxa"/>
+              <w:right w:w="120" w:type="dxa"/>
+            </w:tcMar>
+          </w:tcPr>
+          <w:p>
+            <w:pPr>
+              <w:jc w:val="left"/>
+            </w:pPr>
+            <w:r>
+              <w:rPr>
+                <w:rFonts w:ascii="Times New Roman" w:hAnsi="Times New Roman"/>
+                <w:sz w:val="19"/>
+              </w:rPr>
+              <w:t>Rak Perlengkapan B-2</w:t>
+            </w:r>
+          </w:p>
+        </w:tc>
+        <w:tc>
+          <w:tcPr>
+            <w:tcW w:type="dxa" w:w="1728"/>
+            <w:shd w:fill="FFFFFF"/>
+            <w:tcMar>
+              <w:top w:w="80" w:type="dxa"/>
+              <w:bottom w:w="80" w:type="dxa"/>
+              <w:left w:w="120" w:type="dxa"/>
+              <w:right w:w="120" w:type="dxa"/>
+            </w:tcMar>
+          </w:tcPr>
+          <w:p>
+            <w:pPr>
+              <w:jc w:val="left"/>
+            </w:pPr>
+            <w:r>
+              <w:rPr>
+                <w:rFonts w:ascii="Times New Roman" w:hAnsi="Times New Roman"/>
+                <w:sz w:val="19"/>
+              </w:rPr>
+              <w:t>Siap Pakai / Baik</w:t>
+            </w:r>
+          </w:p>
+        </w:tc>
+      </w:tr>
+      <w:tr>
+        <w:tc>
+          <w:tcPr>
+            <w:tcW w:type="dxa" w:w="720"/>
+            <w:shd w:fill="F1F5F9"/>
+            <w:tcMar>
+              <w:top w:w="80" w:type="dxa"/>
+              <w:bottom w:w="80" w:type="dxa"/>
+              <w:left w:w="120" w:type="dxa"/>
+              <w:right w:w="120" w:type="dxa"/>
+            </w:tcMar>
+          </w:tcPr>
+          <w:p>
+            <w:pPr>
+              <w:jc w:val="center"/>
+            </w:pPr>
+            <w:r>
+              <w:rPr>
+                <w:rFonts w:ascii="Times New Roman" w:hAnsi="Times New Roman"/>
+                <w:sz w:val="19"/>
+              </w:rPr>
+              <w:t>4</w:t>
+            </w:r>
+          </w:p>
+        </w:tc>
+        <w:tc>
+          <w:tcPr>
+            <w:tcW w:type="dxa" w:w="3312"/>
+            <w:shd w:fill="F1F5F9"/>
+            <w:tcMar>
+              <w:top w:w="80" w:type="dxa"/>
+              <w:bottom w:w="80" w:type="dxa"/>
+              <w:left w:w="120" w:type="dxa"/>
+              <w:right w:w="120" w:type="dxa"/>
+            </w:tcMar>
+          </w:tcPr>
+          <w:p>
+            <w:pPr>
+              <w:jc w:val="left"/>
+            </w:pPr>
+            <w:r>
+              <w:rPr>
+                <w:rFonts w:ascii="Times New Roman" w:hAnsi="Times New Roman"/>
+                <w:sz w:val="19"/>
+              </w:rPr>
+              <w:t>Kabel HDMI High-Speed 5 Meter</w:t>
+            </w:r>
+          </w:p>
+        </w:tc>
+        <w:tc>
+          <w:tcPr>
+            <w:tcW w:type="dxa" w:w="1728"/>
+            <w:shd w:fill="F1F5F9"/>
+            <w:tcMar>
+              <w:top w:w="80" w:type="dxa"/>
+              <w:bottom w:w="80" w:type="dxa"/>
+              <w:left w:w="120" w:type="dxa"/>
+              <w:right w:w="120" w:type="dxa"/>
+            </w:tcMar>
+          </w:tcPr>
+          <w:p>
+            <w:pPr>
+              <w:jc w:val="left"/>
+            </w:pPr>
+            <w:r>
+              <w:rPr>
+                <w:rFonts w:ascii="Times New Roman" w:hAnsi="Times New Roman"/>
+                <w:sz w:val="19"/>
+              </w:rPr>
+              <w:t>Aksesoris</w:t>
+            </w:r>
+          </w:p>
+        </w:tc>
+        <w:tc>
+          <w:tcPr>
+            <w:tcW w:type="dxa" w:w="2592"/>
+            <w:shd w:fill="F1F5F9"/>
+            <w:tcMar>
+              <w:top w:w="80" w:type="dxa"/>
+              <w:bottom w:w="80" w:type="dxa"/>
+              <w:left w:w="120" w:type="dxa"/>
+              <w:right w:w="120" w:type="dxa"/>
+            </w:tcMar>
+          </w:tcPr>
+          <w:p>
+            <w:pPr>
+              <w:jc w:val="left"/>
+            </w:pPr>
+            <w:r>
+              <w:rPr>
+                <w:rFonts w:ascii="Times New Roman" w:hAnsi="Times New Roman"/>
+                <w:sz w:val="19"/>
+              </w:rPr>
+              <w:t>Kotak Kabel Rak C-3</w:t>
+            </w:r>
+          </w:p>
+        </w:tc>
+        <w:tc>
+          <w:tcPr>
+            <w:tcW w:type="dxa" w:w="1728"/>
+            <w:shd w:fill="F1F5F9"/>
+            <w:tcMar>
+              <w:top w:w="80" w:type="dxa"/>
+              <w:bottom w:w="80" w:type="dxa"/>
+              <w:left w:w="120" w:type="dxa"/>
+              <w:right w:w="120" w:type="dxa"/>
+            </w:tcMar>
+          </w:tcPr>
+          <w:p>
+            <w:pPr>
+              <w:jc w:val="left"/>
+            </w:pPr>
+            <w:r>
+              <w:rPr>
+                <w:rFonts w:ascii="Times New Roman" w:hAnsi="Times New Roman"/>
+                <w:sz w:val="19"/>
+              </w:rPr>
+              <w:t>Siap Pakai / Baik</w:t>
+            </w:r>
+          </w:p>
+        </w:tc>
+      </w:tr>
+    </w:tbl>
+    <w:p>
+      <w:pPr>
+        <w:spacing w:after="160"/>
+      </w:pPr>
+    </w:p>
+    <w:p>
+      <w:pPr>
+        <w:keepNext/>
+        <w:spacing w:before="240" w:after="80"/>
+      </w:pPr>
+      <w:r>
+        <w:rPr>
+          <w:rFonts w:ascii="Times New Roman" w:hAnsi="Times New Roman"/>
+          <w:b/>
+          <w:color w:val="000000"/>
+          <w:sz w:val="23"/>
+        </w:rPr>
+        <w:t>1.3 Rumusan Masalah</w:t>
+      </w:r>
+    </w:p>
+    <w:p>
+      <w:pPr>
+        <w:spacing w:after="160" w:line="312" w:lineRule="auto"/>
+        <w:jc w:val="both"/>
+      </w:pPr>
+      <w:r>
+        <w:rPr>
+          <w:rFonts w:ascii="Times New Roman" w:hAnsi="Times New Roman"/>
+          <w:sz w:val="22"/>
+        </w:rPr>
+        <w:t>Berdasarkan analisis latar belakang di atas, rumusan masalah yang diselesaikan adalah:</w:t>
       </w:r>
     </w:p>
     <w:p>
@@ -457,7 +1366,7 @@
           <w:rFonts w:ascii="Times New Roman" w:hAnsi="Times New Roman"/>
           <w:sz w:val="22"/>
         </w:rPr>
-        <w:t>Bagaimana merancang sistem inventaris mobile yang mampu mendigitalkan alur peminjaman secara efisien dan transparan?</w:t>
+        <w:t>Bagaimana merancang sistem inventaris mobile yang mendigitalkan seluruh alur permohonan pinjam alat praktikum?</w:t>
       </w:r>
     </w:p>
     <w:p>
@@ -471,7 +1380,7 @@
           <w:rFonts w:ascii="Times New Roman" w:hAnsi="Times New Roman"/>
           <w:sz w:val="22"/>
         </w:rPr>
-        <w:t>Bagaimana memisahkan hak akses sistem secara tegas antara peran Mahasiswa (peminjam) dan Laboran (administrator)?</w:t>
+        <w:t>Bagaimana memisahkan hak akses sistem secara tegas antara peran Mahasiswa dan Laboran?</w:t>
       </w:r>
     </w:p>
     <w:p>
@@ -485,7 +1394,7 @@
           <w:rFonts w:ascii="Times New Roman" w:hAnsi="Times New Roman"/>
           <w:sz w:val="22"/>
         </w:rPr>
-        <w:t>Bagaimana memvalidasi ketersediaan stok barang secara realtime guna mencegah peminjaman melebihi kuota fisik yang ada?</w:t>
+        <w:t>Bagaimana memvalidasi ketersediaan stok fisik barang secara realtime guna mencegah alokasi ganda (*double-booking*)?</w:t>
       </w:r>
     </w:p>
     <w:p>
@@ -499,7 +1408,7 @@
           <w:rFonts w:ascii="Times New Roman" w:hAnsi="Times New Roman"/>
           <w:sz w:val="22"/>
         </w:rPr>
-        <w:t>Bagaimana mengonfigurasi environment pengembangan Flutter SDK dan native Android yang andal untuk mendukung konektivitas cloud?</w:t>
+        <w:t>Bagaimana mengonfigurasi environment pengembangan Flutter SDK dan native Android yang stabil dan andal?</w:t>
       </w:r>
     </w:p>
     <w:p>
@@ -514,7 +1423,7 @@
           <w:color w:val="000000"/>
           <w:sz w:val="23"/>
         </w:rPr>
-        <w:t>1.3 Batasan Masalah</w:t>
+        <w:t>1.4 Batasan Masalah</w:t>
       </w:r>
     </w:p>
     <w:p>
@@ -527,7 +1436,7 @@
           <w:rFonts w:ascii="Times New Roman" w:hAnsi="Times New Roman"/>
           <w:sz w:val="22"/>
         </w:rPr>
-        <w:t>Agar pengerjaan proyek terarah dan tepat guna, batasan masalah ditetapkan sebagai berikut:</w:t>
+        <w:t>Batasan implementasi proyek LabInventory ditetapkan sebagai berikut:</w:t>
       </w:r>
     </w:p>
     <w:p>
@@ -541,7 +1450,7 @@
           <w:rFonts w:ascii="Times New Roman" w:hAnsi="Times New Roman"/>
           <w:sz w:val="22"/>
         </w:rPr>
-        <w:t>Aplikasi dibangun menggunakan framework Flutter 3.x dengan bahasa pemrograman Dart 3.x.</w:t>
+        <w:t>Aplikasi dibangun menggunakan framework Flutter versi 3.13+ dengan bahasa pemrograman Dart versi 3.x.</w:t>
       </w:r>
     </w:p>
     <w:p>
@@ -555,7 +1464,7 @@
           <w:rFonts w:ascii="Times New Roman" w:hAnsi="Times New Roman"/>
           <w:sz w:val="22"/>
         </w:rPr>
-        <w:t>Sistem backend menggunakan layanan Supabase Cloud dengan basis data relasional PostgreSQL 15.</w:t>
+        <w:t>Sistem backend menggunakan layanan Cloud Database Supabase berbasis PostgreSQL versi 15.</w:t>
       </w:r>
     </w:p>
     <w:p>
@@ -569,7 +1478,7 @@
           <w:rFonts w:ascii="Times New Roman" w:hAnsi="Times New Roman"/>
           <w:sz w:val="22"/>
         </w:rPr>
-        <w:t>Target sistem operasi difokuskan pada perangkat mobile Android (minimum Android 8.0 Oreo, target Android 14).</w:t>
+        <w:t>Target sistem operasi difokuskan pada perangkat Android versi 8.0 (API 26) hingga Android 14 (API 34).</w:t>
       </w:r>
     </w:p>
     <w:p>
@@ -583,7 +1492,7 @@
           <w:rFonts w:ascii="Times New Roman" w:hAnsi="Times New Roman"/>
           <w:sz w:val="22"/>
         </w:rPr>
-        <w:t>Aktor pengguna dibatasi pada dua peran utama: Mahasiswa aktif PTI dan Laboran resmi Laboratorium Komputer FKIP Unila.</w:t>
+        <w:t>Pengguna sistem dibatasi pada dua peran: Mahasiswa aktif PTI dan Laboran resmi FKIP Unila.</w:t>
       </w:r>
     </w:p>
     <w:p>
@@ -598,7 +1507,7 @@
           <w:color w:val="000000"/>
           <w:sz w:val="23"/>
         </w:rPr>
-        <w:t>1.4 Capaian Pembelajaran &amp; Tujuan Praktikum</w:t>
+        <w:t>1.5 Capaian Pembelajaran &amp; Tujuan Praktikum</w:t>
       </w:r>
     </w:p>
     <w:p>
@@ -625,7 +1534,7 @@
           <w:rFonts w:ascii="Times New Roman" w:hAnsi="Times New Roman"/>
           <w:sz w:val="22"/>
         </w:rPr>
-        <w:t>Menganalisis kebutuhan fungsional dan non-fungsional sistem inventaris laboratorium komputer.</w:t>
+        <w:t>Menganalisis kebutuhan fungsional (FR) dan non-fungsional (NFR) sistem inventaris laboratorium.</w:t>
       </w:r>
     </w:p>
     <w:p>
@@ -653,7 +1562,7 @@
           <w:rFonts w:ascii="Times New Roman" w:hAnsi="Times New Roman"/>
           <w:sz w:val="22"/>
         </w:rPr>
-        <w:t>Merancang sketsa alur transaksi 4 tahap terstruktur (Pilih Alat, Formulir, Verifikasi KTM, Pengembalian &amp; Cek Fisik).</w:t>
+        <w:t>Merancang sketsa desain antarmuka (wireframe low-fidelity) untuk 4 layar utama aplikasi.</w:t>
       </w:r>
     </w:p>
     <w:p>
@@ -667,7 +1576,7 @@
           <w:rFonts w:ascii="Times New Roman" w:hAnsi="Times New Roman"/>
           <w:sz w:val="22"/>
         </w:rPr>
-        <w:t>Mengonfigurasi environment pengembangan Flutter SDK versi 3.13+ dan native AndroidManifest.xml.</w:t>
+        <w:t>Mengonfigurasi environment pengembangan Flutter SDK versi 3.13.3 dan konfigurasi native Android.</w:t>
       </w:r>
     </w:p>
     <w:p>
@@ -682,7 +1591,7 @@
           <w:color w:val="000000"/>
           <w:sz w:val="23"/>
         </w:rPr>
-        <w:t>1.5 Manfaat Praktikum</w:t>
+        <w:t>1.6 Manfaat Praktikum</w:t>
       </w:r>
     </w:p>
     <w:p>
@@ -727,7 +1636,7 @@
           <w:color w:val="000000"/>
           <w:sz w:val="26"/>
         </w:rPr>
-        <w:t>PERANCANGAN SISTEM &amp; DESAIN USE CASE</w:t>
+        <w:t>PERANCANGAN SISTEM &amp; REKAYASA KEBUTUHAN</w:t>
       </w:r>
     </w:p>
     <w:p>
@@ -769,7 +1678,7 @@
           <w:b/>
           <w:sz w:val="21"/>
         </w:rPr>
-        <w:t>Tabel 1.1: Matriks Kebutuhan Fungsional Sistem LabInventory</w:t>
+        <w:t>Tabel 1.2: Matriks Kebutuhan Fungsional Sistem LabInventory</w:t>
       </w:r>
     </w:p>
     <w:tbl>
@@ -1946,7 +2855,7 @@
           <w:b/>
           <w:sz w:val="21"/>
         </w:rPr>
-        <w:t>Tabel 1.2: Matriks Kebutuhan Non-Fungsional Sistem LabInventory</w:t>
+        <w:t>Tabel 1.3: Matriks Kebutuhan Non-Fungsional Sistem LabInventory</w:t>
       </w:r>
     </w:p>
     <w:tbl>
@@ -2388,7 +3297,7 @@
         <w:drawing>
           <wp:inline xmlns:a="http://schemas.openxmlformats.org/drawingml/2006/main" xmlns:pic="http://schemas.openxmlformats.org/drawingml/2006/picture">
             <wp:extent cx="4937760" cy="2962656"/>
-            <wp:docPr id="2" name="Picture 2"/>
+            <wp:docPr id="6" name="Picture 6"/>
             <wp:cNvGraphicFramePr>
               <a:graphicFrameLocks noChangeAspect="1"/>
             </wp:cNvGraphicFramePr>
@@ -2400,7 +3309,7 @@
                     <pic:cNvPicPr/>
                   </pic:nvPicPr>
                   <pic:blipFill>
-                    <a:blip r:embed="rId10"/>
+                    <a:blip r:embed="rId14"/>
                     <a:stretch>
                       <a:fillRect/>
                     </a:stretch>
@@ -2430,7 +3339,7 @@
           <w:i/>
           <w:sz w:val="20"/>
         </w:rPr>
-        <w:t>Gambar 1.1: Diagram Use Case &amp; Pembagian Peran Aplikasi Mobile LabInventory</w:t>
+        <w:t>Gambar 1.5: Diagram Use Case &amp; Pembagian Peran Aplikasi Mobile LabInventory</w:t>
       </w:r>
     </w:p>
     <w:p>
@@ -2471,7 +3380,7 @@
         <w:drawing>
           <wp:inline xmlns:a="http://schemas.openxmlformats.org/drawingml/2006/main" xmlns:pic="http://schemas.openxmlformats.org/drawingml/2006/picture">
             <wp:extent cx="4937760" cy="2798064"/>
-            <wp:docPr id="3" name="Picture 3"/>
+            <wp:docPr id="7" name="Picture 7"/>
             <wp:cNvGraphicFramePr>
               <a:graphicFrameLocks noChangeAspect="1"/>
             </wp:cNvGraphicFramePr>
@@ -2483,7 +3392,7 @@
                     <pic:cNvPicPr/>
                   </pic:nvPicPr>
                   <pic:blipFill>
-                    <a:blip r:embed="rId11"/>
+                    <a:blip r:embed="rId15"/>
                     <a:stretch>
                       <a:fillRect/>
                     </a:stretch>
@@ -2513,7 +3422,7 @@
           <w:i/>
           <w:sz w:val="20"/>
         </w:rPr>
-        <w:t>Gambar 1.2: Sketsa Desain Wireframe (Low-Fidelity) Antarmuka Aplikasi LabInventory</w:t>
+        <w:t>Gambar 1.6: Sketsa Desain Wireframe (Low-Fidelity) Antarmuka Aplikasi LabInventory</w:t>
       </w:r>
     </w:p>
     <w:p>
@@ -2554,7 +3463,7 @@
         <w:drawing>
           <wp:inline xmlns:a="http://schemas.openxmlformats.org/drawingml/2006/main" xmlns:pic="http://schemas.openxmlformats.org/drawingml/2006/picture">
             <wp:extent cx="4937760" cy="2674620"/>
-            <wp:docPr id="4" name="Picture 4"/>
+            <wp:docPr id="8" name="Picture 8"/>
             <wp:cNvGraphicFramePr>
               <a:graphicFrameLocks noChangeAspect="1"/>
             </wp:cNvGraphicFramePr>
@@ -2566,7 +3475,7 @@
                     <pic:cNvPicPr/>
                   </pic:nvPicPr>
                   <pic:blipFill>
-                    <a:blip r:embed="rId12"/>
+                    <a:blip r:embed="rId16"/>
                     <a:stretch>
                       <a:fillRect/>
                     </a:stretch>
@@ -2596,7 +3505,7 @@
           <w:i/>
           <w:sz w:val="20"/>
         </w:rPr>
-        <w:t>Gambar 1.3: Diagram Arsitektur Komunikasi Flutter Client &amp; Supabase Cloud Backend</w:t>
+        <w:t>Gambar 1.7: Diagram Arsitektur Komunikasi Flutter Client &amp; Supabase Cloud Backend</w:t>
       </w:r>
     </w:p>
     <w:p>
@@ -2638,7 +3547,7 @@
           <w:b/>
           <w:sz w:val="21"/>
         </w:rPr>
-        <w:t>Tabel 1.3: Pemetaan Alur Peminjaman Terstruktur 4 Tahap</w:t>
+        <w:t>Tabel 1.4: Pemetaan Alur Peminjaman Terstruktur 4 Tahap</w:t>
       </w:r>
     </w:p>
     <w:tbl>
@@ -3222,8 +4131,84 @@
           <w:rFonts w:ascii="Times New Roman" w:hAnsi="Times New Roman"/>
           <w:sz w:val="22"/>
         </w:rPr>
-        <w:t>Proyek Flutter `lab_inventory` diinisiasi menggunakan Flutter SDK versi 3.13.3 dan Dart SDK versi 3.0.0. Manajemen dependensi dikonfigurasi melalui berkas `pubspec.yaml` dengan pustaka utama mencakup `supabase_flutter` untuk komunikasi backend, `intl` untuk format penanggalan WIB, serta `google_fonts` untuk tipografi modern.</w:t>
+        <w:t>Proyek Flutter `lab_inventory` diinisiasi menggunakan Flutter SDK versi 3.13.3 dan Dart SDK versi 3.0.0. Manajemen dependensi dikonfigurasi melalui berkas `pubspec.yaml` dengan pustaka utama mencakup `supabase_flutter` untuk komunikasi backend, `intl` untuk format penanggalan WIB, serta `google_fonts` untuk tipografi modern:</w:t>
       </w:r>
+    </w:p>
+    <w:p>
+      <w:pPr>
+        <w:keepNext/>
+        <w:spacing w:before="160" w:after="40"/>
+      </w:pPr>
+      <w:r>
+        <w:rPr>
+          <w:rFonts w:ascii="Times New Roman" w:hAnsi="Times New Roman"/>
+          <w:b/>
+          <w:sz w:val="20"/>
+        </w:rPr>
+        <w:t>Cuplikan Kode 1.1: Konfigurasi Dependensi pada berkas pubspec.yaml</w:t>
+      </w:r>
+    </w:p>
+    <w:tbl>
+      <w:tblPr>
+        <w:tblW w:type="auto" w:w="0"/>
+        <w:jc w:val="center"/>
+        <w:tblLook w:firstColumn="1" w:firstRow="1" w:lastColumn="0" w:lastRow="0" w:noHBand="0" w:noVBand="1" w:val="04A0"/>
+      </w:tblPr>
+      <w:tblGrid>
+        <w:gridCol w:w="9101"/>
+      </w:tblGrid>
+      <w:tr>
+        <w:tc>
+          <w:tcPr>
+            <w:tcW w:type="dxa" w:w="9072"/>
+            <w:shd w:fill="F1F5F9"/>
+            <w:tcMar>
+              <w:top w:w="100" w:type="dxa"/>
+              <w:bottom w:w="100" w:type="dxa"/>
+              <w:left w:w="140" w:type="dxa"/>
+              <w:right w:w="140" w:type="dxa"/>
+            </w:tcMar>
+            <w:tcBorders>
+              <w:top w:val="single" w:sz="6" w:space="0" w:color="94A3B8"/>
+              <w:left w:val="single" w:sz="24" w:space="0" w:color="1E3A8A"/>
+              <w:bottom w:val="single" w:sz="6" w:space="0" w:color="94A3B8"/>
+              <w:right w:val="single" w:sz="6" w:space="0" w:color="94A3B8"/>
+            </w:tcBorders>
+          </w:tcPr>
+          <w:p>
+            <w:pPr>
+              <w:spacing w:line="252" w:lineRule="auto" w:after="0"/>
+            </w:pPr>
+            <w:r>
+              <w:rPr>
+                <w:rFonts w:ascii="Consolas" w:hAnsi="Consolas"/>
+                <w:color w:val="1E293B"/>
+                <w:sz w:val="17"/>
+              </w:rPr>
+              <w:t>dependencies:</w:t>
+              <w:br/>
+              <w:t xml:space="preserve">  flutter:</w:t>
+              <w:br/>
+              <w:t xml:space="preserve">    sdk: flutter</w:t>
+              <w:br/>
+              <w:t xml:space="preserve">  supabase_flutter: ^2.5.0</w:t>
+              <w:br/>
+              <w:t xml:space="preserve">  intl: ^0.19.0</w:t>
+              <w:br/>
+              <w:t xml:space="preserve">  google_fonts: ^6.2.1</w:t>
+              <w:br/>
+              <w:t xml:space="preserve">  flutter_staggered_animations: ^1.1.1</w:t>
+              <w:br/>
+              <w:t xml:space="preserve">  uuid: ^4.3.3</w:t>
+            </w:r>
+          </w:p>
+        </w:tc>
+      </w:tr>
+    </w:tbl>
+    <w:p>
+      <w:pPr>
+        <w:spacing w:after="120"/>
+      </w:pPr>
     </w:p>
     <w:p>
       <w:pPr>
@@ -3250,8 +4235,86 @@
           <w:rFonts w:ascii="Times New Roman" w:hAnsi="Times New Roman"/>
           <w:sz w:val="22"/>
         </w:rPr>
-        <w:t>Pada lapisan native Android, berkas `android/app/src/main/AndroidManifest.xml` dikonfigurasi dengan menyertakan izin jaringan `android.permission.INTERNET` dan `android.permission.ACCESS_NETWORK_STATE` guna mendukung komunikasi cloud via HTTPS TLS 1.3.</w:t>
+        <w:t>Pada lapisan native Android, berkas `android/app/src/main/AndroidManifest.xml` dikonfigurasi dengan menyertakan izin jaringan `android.permission.INTERNET` dan `android.permission.ACCESS_NETWORK_STATE` guna mendukung komunikasi cloud via HTTPS TLS 1.3:</w:t>
       </w:r>
+    </w:p>
+    <w:p>
+      <w:pPr>
+        <w:keepNext/>
+        <w:spacing w:before="160" w:after="40"/>
+      </w:pPr>
+      <w:r>
+        <w:rPr>
+          <w:rFonts w:ascii="Times New Roman" w:hAnsi="Times New Roman"/>
+          <w:b/>
+          <w:sz w:val="20"/>
+        </w:rPr>
+        <w:t>Cuplikan Kode 1.2: Konfigurasi Izin Jaringan Native AndroidManifest.xml</w:t>
+      </w:r>
+    </w:p>
+    <w:tbl>
+      <w:tblPr>
+        <w:tblW w:type="auto" w:w="0"/>
+        <w:jc w:val="center"/>
+        <w:tblLook w:firstColumn="1" w:firstRow="1" w:lastColumn="0" w:lastRow="0" w:noHBand="0" w:noVBand="1" w:val="04A0"/>
+      </w:tblPr>
+      <w:tblGrid>
+        <w:gridCol w:w="9101"/>
+      </w:tblGrid>
+      <w:tr>
+        <w:tc>
+          <w:tcPr>
+            <w:tcW w:type="dxa" w:w="9072"/>
+            <w:shd w:fill="F1F5F9"/>
+            <w:tcMar>
+              <w:top w:w="100" w:type="dxa"/>
+              <w:bottom w:w="100" w:type="dxa"/>
+              <w:left w:w="140" w:type="dxa"/>
+              <w:right w:w="140" w:type="dxa"/>
+            </w:tcMar>
+            <w:tcBorders>
+              <w:top w:val="single" w:sz="6" w:space="0" w:color="94A3B8"/>
+              <w:left w:val="single" w:sz="24" w:space="0" w:color="1E3A8A"/>
+              <w:bottom w:val="single" w:sz="6" w:space="0" w:color="94A3B8"/>
+              <w:right w:val="single" w:sz="6" w:space="0" w:color="94A3B8"/>
+            </w:tcBorders>
+          </w:tcPr>
+          <w:p>
+            <w:pPr>
+              <w:spacing w:line="252" w:lineRule="auto" w:after="0"/>
+            </w:pPr>
+            <w:r>
+              <w:rPr>
+                <w:rFonts w:ascii="Consolas" w:hAnsi="Consolas"/>
+                <w:color w:val="1E293B"/>
+                <w:sz w:val="17"/>
+              </w:rPr>
+              <w:t>&lt;manifest xmlns:android="http://schemas.android.com/apk/res/android"</w:t>
+              <w:br/>
+              <w:t xml:space="preserve">    package="com.unila.lab_inventory"&gt;</w:t>
+              <w:br/>
+              <w:t xml:space="preserve">    &lt;uses-permission android:name="android.permission.INTERNET"/&gt;</w:t>
+              <w:br/>
+              <w:t xml:space="preserve">    &lt;uses-permission android:name="android.permission.ACCESS_NETWORK_STATE"/&gt;</w:t>
+              <w:br/>
+              <w:t xml:space="preserve">    &lt;application</w:t>
+              <w:br/>
+              <w:t xml:space="preserve">        android:label="LabInventory Unila"</w:t>
+              <w:br/>
+              <w:t xml:space="preserve">        android:icon="@mipmap/ic_launcher"&gt;</w:t>
+              <w:br/>
+              <w:t xml:space="preserve">    &lt;/application&gt;</w:t>
+              <w:br/>
+              <w:t>&lt;/manifest&gt;</w:t>
+            </w:r>
+          </w:p>
+        </w:tc>
+      </w:tr>
+    </w:tbl>
+    <w:p>
+      <w:pPr>
+        <w:spacing w:after="120"/>
+      </w:pPr>
     </w:p>
     <w:p>
       <w:pPr>
@@ -3263,7 +4326,7 @@
         <w:drawing>
           <wp:inline xmlns:a="http://schemas.openxmlformats.org/drawingml/2006/main" xmlns:pic="http://schemas.openxmlformats.org/drawingml/2006/picture">
             <wp:extent cx="1371600" cy="1371600"/>
-            <wp:docPr id="5" name="Picture 5"/>
+            <wp:docPr id="9" name="Picture 9"/>
             <wp:cNvGraphicFramePr>
               <a:graphicFrameLocks noChangeAspect="1"/>
             </wp:cNvGraphicFramePr>
@@ -3275,7 +4338,7 @@
                     <pic:cNvPicPr/>
                   </pic:nvPicPr>
                   <pic:blipFill>
-                    <a:blip r:embed="rId13"/>
+                    <a:blip r:embed="rId17"/>
                     <a:stretch>
                       <a:fillRect/>
                     </a:stretch>
@@ -3305,7 +4368,7 @@
           <w:i/>
           <w:sz w:val="20"/>
         </w:rPr>
-        <w:t>Gambar 1.4: Desain Ikon Launcher Resmi Aplikasi LabInventory pada Sistem Operasi Android</w:t>
+        <w:t>Gambar 1.8: Desain Ikon Launcher Resmi Aplikasi LabInventory pada Sistem Operasi Android</w:t>
       </w:r>
     </w:p>
     <w:p>
@@ -3347,7 +4410,7 @@
           <w:b/>
           <w:sz w:val="21"/>
         </w:rPr>
-        <w:t>Tabel 1.4: Struktur Direktori Proyek Hasil Inisiasi Minggu I</w:t>
+        <w:t>Tabel 1.5: Struktur Direktori Proyek Hasil Inisiasi Minggu I</w:t>
       </w:r>
     </w:p>
     <w:tbl>
@@ -3816,7 +4879,7 @@
         <w:drawing>
           <wp:inline xmlns:a="http://schemas.openxmlformats.org/drawingml/2006/main" xmlns:pic="http://schemas.openxmlformats.org/drawingml/2006/picture">
             <wp:extent cx="4754880" cy="2680023"/>
-            <wp:docPr id="6" name="Picture 6"/>
+            <wp:docPr id="10" name="Picture 10"/>
             <wp:cNvGraphicFramePr>
               <a:graphicFrameLocks noChangeAspect="1"/>
             </wp:cNvGraphicFramePr>
@@ -3828,7 +4891,7 @@
                     <pic:cNvPicPr/>
                   </pic:nvPicPr>
                   <pic:blipFill>
-                    <a:blip r:embed="rId14"/>
+                    <a:blip r:embed="rId18"/>
                     <a:stretch>
                       <a:fillRect/>
                     </a:stretch>
@@ -3858,7 +4921,7 @@
           <w:i/>
           <w:sz w:val="20"/>
         </w:rPr>
-        <w:t>Gambar 1.5: Hasil Verifikasi Environment Pengembangan Flutter SDK &amp; Android Toolchain (flutter doctor -v)</w:t>
+        <w:t>Gambar 1.9: Hasil Verifikasi Environment Pengembangan Flutter SDK &amp; Android Toolchain (flutter doctor -v)</w:t>
       </w:r>
     </w:p>
     <w:p>
@@ -3948,7 +5011,7 @@
           <w:rFonts w:ascii="Times New Roman" w:hAnsi="Times New Roman"/>
           <w:sz w:val="22"/>
         </w:rPr>
-        <w:t>Tahapan inisiasi proyek, analisis kebutuhan sistem (fungsional &amp; non-fungsional), perancangan diagram use case, arsitektur cloud, serta penyiapan environment pengembangan Flutter pada Minggu I telah berhasil dituntaskan secara paripurna (100%). Seluruh prasyarat arsitektural telah siap untuk memasuki tahap slicing antarmuka pengguna pada Minggu II.</w:t>
+        <w:t>Tahapan inisiasi proyek, inventarisasi aset fisik lab, analisis kebutuhan sistem (fungsional &amp; non-fungsional), perancangan diagram use case, sketsa wireframe, arsitektur cloud, serta penyiapan environment pengembangan Flutter pada Minggu I telah berhasil dituntaskan secara paripurna (100%). Seluruh prasyarat arsitektural telah siap untuk memasuki tahap slicing antarmuka pengguna pada Minggu II.</w:t>
       </w:r>
     </w:p>
     <w:p>

</xml_diff>